<commit_message>
Update CBE metrics, ratios, Egyptian settings, engine and cash flow fixes
</commit_message>
<xml_diff>
--- a/Engine_Overview.docx
+++ b/Engine_Overview.docx
@@ -313,7 +313,7 @@
           <w:sz w:val="18"/>
           <w:szCs w:val="18"/>
         </w:rPr>
-        <w:t xml:space="preserve">Generated: February 24, 2026</w:t>
+        <w:t xml:space="preserve">Generated: March 7, 2026</w:t>
       </w:r>
     </w:p>
     <w:p>
@@ -2352,6 +2352,22 @@
           <w:sz w:val="18"/>
           <w:szCs w:val="18"/>
         </w:rPr>
+        <w:t xml:space="preserve">│   ├── templates/egyptian-industries.ts  # 5 sector-specific assumption templates</w:t>
+      </w:r>
+    </w:p>
+    <w:p>
+      <w:pPr>
+        <w:shd w:fill="F8F9FA" w:color="F8F9FA" w:val="solid"/>
+        <w:spacing w:after="20"/>
+        <w:ind w:left="360"/>
+      </w:pPr>
+      <w:r>
+        <w:rPr>
+          <w:rFonts w:ascii="Consolas" w:cs="Consolas" w:eastAsia="Consolas" w:hAnsi="Consolas"/>
+          <w:color w:val="3B82F6"/>
+          <w:sz w:val="18"/>
+          <w:szCs w:val="18"/>
+        </w:rPr>
         <w:t xml:space="preserve">│   ├── schedules/egyptian-depreciation.ts</w:t>
       </w:r>
     </w:p>
@@ -2522,7 +2538,7 @@
           <w:sz w:val="26"/>
           <w:szCs w:val="26"/>
         </w:rPr>
-        <w:t xml:space="preserve">3.1 AssumptionSet (assumptions.ts) — 60+ fields</w:t>
+        <w:t xml:space="preserve">3.1 AssumptionSet (assumptions.ts) — 90+ fields</w:t>
       </w:r>
     </w:p>
     <w:p>
@@ -2541,7 +2557,7 @@
           <w:sz w:val="20"/>
           <w:szCs w:val="20"/>
         </w:rPr>
-        <w:t xml:space="preserve">The main projection configuration with ~60 fields organized by category:</w:t>
+        <w:t xml:space="preserve">The main projection configuration organized by category. Fields marked with [] are per-projection-year arrays:</w:t>
       </w:r>
     </w:p>
     <w:tbl>
@@ -2566,7 +2582,7 @@
         </w:trPr>
         <w:tc>
           <w:tcPr>
-            <w:tcW w:type="pct" w:w="25%"/>
+            <w:tcW w:type="pct" w:w="21%"/>
             <w:shd w:fill="1E3A8A" w:color="1E3A8A" w:val="solid"/>
             <w:tcMar>
               <w:top w:type="dxa" w:w="40"/>
@@ -2594,7 +2610,7 @@
         </w:tc>
         <w:tc>
           <w:tcPr>
-            <w:tcW w:type="pct" w:w="75%"/>
+            <w:tcW w:type="pct" w:w="79%"/>
             <w:shd w:fill="1E3A8A" w:color="1E3A8A" w:val="solid"/>
             <w:tcMar>
               <w:top w:type="dxa" w:w="40"/>
@@ -2624,7 +2640,7 @@
       <w:tr>
         <w:tc>
           <w:tcPr>
-            <w:tcW w:type="pct" w:w="25%"/>
+            <w:tcW w:type="pct" w:w="21%"/>
             <w:shd w:fill="F3F4F6" w:color="F3F4F6" w:val="solid"/>
             <w:tcMar>
               <w:top w:type="dxa" w:w="40"/>
@@ -2652,7 +2668,7 @@
         </w:tc>
         <w:tc>
           <w:tcPr>
-            <w:tcW w:type="pct" w:w="75%"/>
+            <w:tcW w:type="pct" w:w="79%"/>
             <w:shd w:fill="F3F4F6" w:color="F3F4F6" w:val="solid"/>
             <w:tcMar>
               <w:top w:type="dxa" w:w="40"/>
@@ -2682,7 +2698,7 @@
       <w:tr>
         <w:tc>
           <w:tcPr>
-            <w:tcW w:type="pct" w:w="25%"/>
+            <w:tcW w:type="pct" w:w="21%"/>
             <w:shd w:fill="FFFFFF" w:color="FFFFFF" w:val="solid"/>
             <w:tcMar>
               <w:top w:type="dxa" w:w="40"/>
@@ -2710,7 +2726,7 @@
         </w:tc>
         <w:tc>
           <w:tcPr>
-            <w:tcW w:type="pct" w:w="75%"/>
+            <w:tcW w:type="pct" w:w="79%"/>
             <w:shd w:fill="FFFFFF" w:color="FFFFFF" w:val="solid"/>
             <w:tcMar>
               <w:top w:type="dxa" w:w="40"/>
@@ -2740,7 +2756,7 @@
       <w:tr>
         <w:tc>
           <w:tcPr>
-            <w:tcW w:type="pct" w:w="25%"/>
+            <w:tcW w:type="pct" w:w="21%"/>
             <w:shd w:fill="F3F4F6" w:color="F3F4F6" w:val="solid"/>
             <w:tcMar>
               <w:top w:type="dxa" w:w="40"/>
@@ -2768,29 +2784,29 @@
         </w:tc>
         <w:tc>
           <w:tcPr>
-            <w:tcW w:type="pct" w:w="75%"/>
-            <w:shd w:fill="F3F4F6" w:color="F3F4F6" w:val="solid"/>
-            <w:tcMar>
-              <w:top w:type="dxa" w:w="40"/>
-              <w:left w:type="dxa" w:w="80"/>
-              <w:bottom w:type="dxa" w:w="40"/>
-              <w:right w:type="dxa" w:w="80"/>
-            </w:tcMar>
-          </w:tcPr>
-          <w:p>
-            <w:pPr>
-              <w:spacing w:after="0"/>
-            </w:pPr>
-            <w:r>
-              <w:rPr>
-                <w:rFonts w:ascii="Calibri" w:cs="Calibri" w:eastAsia="Calibri" w:hAnsi="Calibri"/>
-                <w:b w:val="false"/>
-                <w:bCs w:val="false"/>
-                <w:color w:val="1F2937"/>
-                <w:sz w:val="18"/>
-                <w:szCs w:val="18"/>
-              </w:rPr>
-              <w:t xml:space="preserve">dso[], dio[], dpo[], prepaidPercent[], accruedExpPercent[], deferredRevPercent[], otherCAPercent[], otherCLPercent[]</w:t>
+            <w:tcW w:type="pct" w:w="79%"/>
+            <w:shd w:fill="F3F4F6" w:color="F3F4F6" w:val="solid"/>
+            <w:tcMar>
+              <w:top w:type="dxa" w:w="40"/>
+              <w:left w:type="dxa" w:w="80"/>
+              <w:bottom w:type="dxa" w:w="40"/>
+              <w:right w:type="dxa" w:w="80"/>
+            </w:tcMar>
+          </w:tcPr>
+          <w:p>
+            <w:pPr>
+              <w:spacing w:after="0"/>
+            </w:pPr>
+            <w:r>
+              <w:rPr>
+                <w:rFonts w:ascii="Calibri" w:cs="Calibri" w:eastAsia="Calibri" w:hAnsi="Calibri"/>
+                <w:b w:val="false"/>
+                <w:bCs w:val="false"/>
+                <w:color w:val="1F2937"/>
+                <w:sz w:val="18"/>
+                <w:szCs w:val="18"/>
+              </w:rPr>
+              <w:t xml:space="preserve">dso[], dio[], dpo[], prepaidPercent[], accruedExpPercent[], deferredRevPercent[]</w:t>
             </w:r>
           </w:p>
         </w:tc>
@@ -2798,7 +2814,7 @@
       <w:tr>
         <w:tc>
           <w:tcPr>
-            <w:tcW w:type="pct" w:w="25%"/>
+            <w:tcW w:type="pct" w:w="21%"/>
             <w:shd w:fill="FFFFFF" w:color="FFFFFF" w:val="solid"/>
             <w:tcMar>
               <w:top w:type="dxa" w:w="40"/>
@@ -2820,13 +2836,13 @@
                 <w:sz w:val="18"/>
                 <w:szCs w:val="18"/>
               </w:rPr>
-              <w:t xml:space="preserve">Non-Current Assets</w:t>
-            </w:r>
-          </w:p>
-        </w:tc>
-        <w:tc>
-          <w:tcPr>
-            <w:tcW w:type="pct" w:w="75%"/>
+              <w:t xml:space="preserve">CapEx &amp; Depr.</w:t>
+            </w:r>
+          </w:p>
+        </w:tc>
+        <w:tc>
+          <w:tcPr>
+            <w:tcW w:type="pct" w:w="79%"/>
             <w:shd w:fill="FFFFFF" w:color="FFFFFF" w:val="solid"/>
             <w:tcMar>
               <w:top w:type="dxa" w:w="40"/>
@@ -2848,7 +2864,7 @@
                 <w:sz w:val="18"/>
                 <w:szCs w:val="18"/>
               </w:rPr>
-              <w:t xml:space="preserve">capexPercent[], depreciationRate[], amortizationAmount[], intangiblesAmount[], goodwillAmount[], otherLTAPercent[]</w:t>
+              <w:t xml:space="preserve">capexPercent[], depreciationRate[], amortizationAmount[], depreciationMethod (straight-line|declining-balance|egyptian-tax)</w:t>
             </w:r>
           </w:p>
         </w:tc>
@@ -2856,57 +2872,57 @@
       <w:tr>
         <w:tc>
           <w:tcPr>
-            <w:tcW w:type="pct" w:w="25%"/>
-            <w:shd w:fill="F3F4F6" w:color="F3F4F6" w:val="solid"/>
-            <w:tcMar>
-              <w:top w:type="dxa" w:w="40"/>
-              <w:left w:type="dxa" w:w="80"/>
-              <w:bottom w:type="dxa" w:w="40"/>
-              <w:right w:type="dxa" w:w="80"/>
-            </w:tcMar>
-          </w:tcPr>
-          <w:p>
-            <w:pPr>
-              <w:spacing w:after="0"/>
-            </w:pPr>
-            <w:r>
-              <w:rPr>
-                <w:rFonts w:ascii="Calibri" w:cs="Calibri" w:eastAsia="Calibri" w:hAnsi="Calibri"/>
-                <w:b w:val="false"/>
-                <w:bCs w:val="false"/>
-                <w:color w:val="1F2937"/>
-                <w:sz w:val="18"/>
-                <w:szCs w:val="18"/>
-              </w:rPr>
-              <w:t xml:space="preserve">Debt</w:t>
-            </w:r>
-          </w:p>
-        </w:tc>
-        <w:tc>
-          <w:tcPr>
-            <w:tcW w:type="pct" w:w="75%"/>
-            <w:shd w:fill="F3F4F6" w:color="F3F4F6" w:val="solid"/>
-            <w:tcMar>
-              <w:top w:type="dxa" w:w="40"/>
-              <w:left w:type="dxa" w:w="80"/>
-              <w:bottom w:type="dxa" w:w="40"/>
-              <w:right w:type="dxa" w:w="80"/>
-            </w:tcMar>
-          </w:tcPr>
-          <w:p>
-            <w:pPr>
-              <w:spacing w:after="0"/>
-            </w:pPr>
-            <w:r>
-              <w:rPr>
-                <w:rFonts w:ascii="Calibri" w:cs="Calibri" w:eastAsia="Calibri" w:hAnsi="Calibri"/>
-                <w:b w:val="false"/>
-                <w:bCs w:val="false"/>
-                <w:color w:val="1F2937"/>
-                <w:sz w:val="18"/>
-                <w:szCs w:val="18"/>
-              </w:rPr>
-              <w:t xml:space="preserve">interestRate[], shortTermDebt[], longTermDebtIssuance[], longTermDebtRepayment[], currentPortionLTD[], deferredTaxLiabilityPercent[]</w:t>
+            <w:tcW w:type="pct" w:w="21%"/>
+            <w:shd w:fill="F3F4F6" w:color="F3F4F6" w:val="solid"/>
+            <w:tcMar>
+              <w:top w:type="dxa" w:w="40"/>
+              <w:left w:type="dxa" w:w="80"/>
+              <w:bottom w:type="dxa" w:w="40"/>
+              <w:right w:type="dxa" w:w="80"/>
+            </w:tcMar>
+          </w:tcPr>
+          <w:p>
+            <w:pPr>
+              <w:spacing w:after="0"/>
+            </w:pPr>
+            <w:r>
+              <w:rPr>
+                <w:rFonts w:ascii="Calibri" w:cs="Calibri" w:eastAsia="Calibri" w:hAnsi="Calibri"/>
+                <w:b w:val="false"/>
+                <w:bCs w:val="false"/>
+                <w:color w:val="1F2937"/>
+                <w:sz w:val="18"/>
+                <w:szCs w:val="18"/>
+              </w:rPr>
+              <w:t xml:space="preserve">Debt &amp; Financing</w:t>
+            </w:r>
+          </w:p>
+        </w:tc>
+        <w:tc>
+          <w:tcPr>
+            <w:tcW w:type="pct" w:w="79%"/>
+            <w:shd w:fill="F3F4F6" w:color="F3F4F6" w:val="solid"/>
+            <w:tcMar>
+              <w:top w:type="dxa" w:w="40"/>
+              <w:left w:type="dxa" w:w="80"/>
+              <w:bottom w:type="dxa" w:w="40"/>
+              <w:right w:type="dxa" w:w="80"/>
+            </w:tcMar>
+          </w:tcPr>
+          <w:p>
+            <w:pPr>
+              <w:spacing w:after="0"/>
+            </w:pPr>
+            <w:r>
+              <w:rPr>
+                <w:rFonts w:ascii="Calibri" w:cs="Calibri" w:eastAsia="Calibri" w:hAnsi="Calibri"/>
+                <w:b w:val="false"/>
+                <w:bCs w:val="false"/>
+                <w:color w:val="1F2937"/>
+                <w:sz w:val="18"/>
+                <w:szCs w:val="18"/>
+              </w:rPr>
+              <w:t xml:space="preserve">cbeRate (27.25%), interestRateOnDebt[] ([22%,22%,20%,18%,18%]), interestRateOnCash[], legacyDebtRate (4.5%), shortTermDebtAmount[], longTermDebtIssuance[], longTermDebtRepayment[], currentPortionLTD[]</w:t>
             </w:r>
           </w:p>
         </w:tc>
@@ -2914,7 +2930,7 @@
       <w:tr>
         <w:tc>
           <w:tcPr>
-            <w:tcW w:type="pct" w:w="25%"/>
+            <w:tcW w:type="pct" w:w="21%"/>
             <w:shd w:fill="FFFFFF" w:color="FFFFFF" w:val="solid"/>
             <w:tcMar>
               <w:top w:type="dxa" w:w="40"/>
@@ -2942,7 +2958,7 @@
         </w:tc>
         <w:tc>
           <w:tcPr>
-            <w:tcW w:type="pct" w:w="75%"/>
+            <w:tcW w:type="pct" w:w="79%"/>
             <w:shd w:fill="FFFFFF" w:color="FFFFFF" w:val="solid"/>
             <w:tcMar>
               <w:top w:type="dxa" w:w="40"/>
@@ -2964,7 +2980,7 @@
                 <w:sz w:val="18"/>
                 <w:szCs w:val="18"/>
               </w:rPr>
-              <w:t xml:space="preserve">commonStock[], APIC[], sharesOutstanding[], stockBasedCompAmount[], dividendPayoutRatio[], equityIssuance[], shareRepurchaseAmount[]</w:t>
+              <w:t xml:space="preserve">sharesOutstanding[], dividendPayoutRatio[], shareRepurchaseAmount[], stockBasedCompAmount[], commonStock[], apic[], oci[], equityIssuance[]</w:t>
             </w:r>
           </w:p>
         </w:tc>
@@ -2972,57 +2988,57 @@
       <w:tr>
         <w:tc>
           <w:tcPr>
-            <w:tcW w:type="pct" w:w="25%"/>
-            <w:shd w:fill="F3F4F6" w:color="F3F4F6" w:val="solid"/>
-            <w:tcMar>
-              <w:top w:type="dxa" w:w="40"/>
-              <w:left w:type="dxa" w:w="80"/>
-              <w:bottom w:type="dxa" w:w="40"/>
-              <w:right w:type="dxa" w:w="80"/>
-            </w:tcMar>
-          </w:tcPr>
-          <w:p>
-            <w:pPr>
-              <w:spacing w:after="0"/>
-            </w:pPr>
-            <w:r>
-              <w:rPr>
-                <w:rFonts w:ascii="Calibri" w:cs="Calibri" w:eastAsia="Calibri" w:hAnsi="Calibri"/>
-                <w:b w:val="false"/>
-                <w:bCs w:val="false"/>
-                <w:color w:val="1F2937"/>
-                <w:sz w:val="18"/>
-                <w:szCs w:val="18"/>
-              </w:rPr>
-              <w:t xml:space="preserve">Tax / VAT</w:t>
-            </w:r>
-          </w:p>
-        </w:tc>
-        <w:tc>
-          <w:tcPr>
-            <w:tcW w:type="pct" w:w="75%"/>
-            <w:shd w:fill="F3F4F6" w:color="F3F4F6" w:val="solid"/>
-            <w:tcMar>
-              <w:top w:type="dxa" w:w="40"/>
-              <w:left w:type="dxa" w:w="80"/>
-              <w:bottom w:type="dxa" w:w="40"/>
-              <w:right w:type="dxa" w:w="80"/>
-            </w:tcMar>
-          </w:tcPr>
-          <w:p>
-            <w:pPr>
-              <w:spacing w:after="0"/>
-            </w:pPr>
-            <w:r>
-              <w:rPr>
-                <w:rFonts w:ascii="Calibri" w:cs="Calibri" w:eastAsia="Calibri" w:hAnsi="Calibri"/>
-                <w:b w:val="false"/>
-                <w:bCs w:val="false"/>
-                <w:color w:val="1F2937"/>
-                <w:sz w:val="18"/>
-                <w:szCs w:val="18"/>
-              </w:rPr>
-              <w:t xml:space="preserve">taxRate[], enableVAT, vatRate, interestIncomeRate[]</w:t>
+            <w:tcW w:type="pct" w:w="21%"/>
+            <w:shd w:fill="F3F4F6" w:color="F3F4F6" w:val="solid"/>
+            <w:tcMar>
+              <w:top w:type="dxa" w:w="40"/>
+              <w:left w:type="dxa" w:w="80"/>
+              <w:bottom w:type="dxa" w:w="40"/>
+              <w:right w:type="dxa" w:w="80"/>
+            </w:tcMar>
+          </w:tcPr>
+          <w:p>
+            <w:pPr>
+              <w:spacing w:after="0"/>
+            </w:pPr>
+            <w:r>
+              <w:rPr>
+                <w:rFonts w:ascii="Calibri" w:cs="Calibri" w:eastAsia="Calibri" w:hAnsi="Calibri"/>
+                <w:b w:val="false"/>
+                <w:bCs w:val="false"/>
+                <w:color w:val="1F2937"/>
+                <w:sz w:val="18"/>
+                <w:szCs w:val="18"/>
+              </w:rPr>
+              <w:t xml:space="preserve">Tax &amp; Regime</w:t>
+            </w:r>
+          </w:p>
+        </w:tc>
+        <w:tc>
+          <w:tcPr>
+            <w:tcW w:type="pct" w:w="79%"/>
+            <w:shd w:fill="F3F4F6" w:color="F3F4F6" w:val="solid"/>
+            <w:tcMar>
+              <w:top w:type="dxa" w:w="40"/>
+              <w:left w:type="dxa" w:w="80"/>
+              <w:bottom w:type="dxa" w:w="40"/>
+              <w:right w:type="dxa" w:w="80"/>
+            </w:tcMar>
+          </w:tcPr>
+          <w:p>
+            <w:pPr>
+              <w:spacing w:after="0"/>
+            </w:pPr>
+            <w:r>
+              <w:rPr>
+                <w:rFonts w:ascii="Calibri" w:cs="Calibri" w:eastAsia="Calibri" w:hAnsi="Calibri"/>
+                <w:b w:val="false"/>
+                <w:bCs w:val="false"/>
+                <w:color w:val="1F2937"/>
+                <w:sz w:val="18"/>
+                <w:szCs w:val="18"/>
+              </w:rPr>
+              <w:t xml:space="preserve">taxRate[] (default 22.5%), taxRegime (standard|oil|strategic|sme), enableVAT, vatRate (14%)</w:t>
             </w:r>
           </w:p>
         </w:tc>
@@ -3030,7 +3046,7 @@
       <w:tr>
         <w:tc>
           <w:tcPr>
-            <w:tcW w:type="pct" w:w="25%"/>
+            <w:tcW w:type="pct" w:w="21%"/>
             <w:shd w:fill="FFFFFF" w:color="FFFFFF" w:val="solid"/>
             <w:tcMar>
               <w:top w:type="dxa" w:w="40"/>
@@ -3052,13 +3068,13 @@
                 <w:sz w:val="18"/>
                 <w:szCs w:val="18"/>
               </w:rPr>
-              <w:t xml:space="preserve">DCF / Valuation</w:t>
-            </w:r>
-          </w:p>
-        </w:tc>
-        <w:tc>
-          <w:tcPr>
-            <w:tcW w:type="pct" w:w="75%"/>
+              <w:t xml:space="preserve">Employee Profit Sharing</w:t>
+            </w:r>
+          </w:p>
+        </w:tc>
+        <w:tc>
+          <w:tcPr>
+            <w:tcW w:type="pct" w:w="79%"/>
             <w:shd w:fill="FFFFFF" w:color="FFFFFF" w:val="solid"/>
             <w:tcMar>
               <w:top w:type="dxa" w:w="40"/>
@@ -3080,7 +3096,7 @@
                 <w:sz w:val="18"/>
                 <w:szCs w:val="18"/>
               </w:rPr>
-              <w:t xml:space="preserve">cbeRate (CBE overnight rate, default 27.25%), beta (default 1.0), equityRiskPremium (default 7%), terminalGrowthRate (default 5%), sharePrice (optional, enables multiples)</w:t>
+              <w:t xml:space="preserve">employeeProfitSharingRate (10%), enableEmployeeProfitShare, totalAnnualPayroll (EPD cap)</w:t>
             </w:r>
           </w:p>
         </w:tc>
@@ -3088,57 +3104,57 @@
       <w:tr>
         <w:tc>
           <w:tcPr>
-            <w:tcW w:type="pct" w:w="25%"/>
-            <w:shd w:fill="F3F4F6" w:color="F3F4F6" w:val="solid"/>
-            <w:tcMar>
-              <w:top w:type="dxa" w:w="40"/>
-              <w:left w:type="dxa" w:w="80"/>
-              <w:bottom w:type="dxa" w:w="40"/>
-              <w:right w:type="dxa" w:w="80"/>
-            </w:tcMar>
-          </w:tcPr>
-          <w:p>
-            <w:pPr>
-              <w:spacing w:after="0"/>
-            </w:pPr>
-            <w:r>
-              <w:rPr>
-                <w:rFonts w:ascii="Calibri" w:cs="Calibri" w:eastAsia="Calibri" w:hAnsi="Calibri"/>
-                <w:b w:val="false"/>
-                <w:bCs w:val="false"/>
-                <w:color w:val="1F2937"/>
-                <w:sz w:val="18"/>
-                <w:szCs w:val="18"/>
-              </w:rPr>
-              <w:t xml:space="preserve">Egyptian</w:t>
-            </w:r>
-          </w:p>
-        </w:tc>
-        <w:tc>
-          <w:tcPr>
-            <w:tcW w:type="pct" w:w="75%"/>
-            <w:shd w:fill="F3F4F6" w:color="F3F4F6" w:val="solid"/>
-            <w:tcMar>
-              <w:top w:type="dxa" w:w="40"/>
-              <w:left w:type="dxa" w:w="80"/>
-              <w:bottom w:type="dxa" w:w="40"/>
-              <w:right w:type="dxa" w:w="80"/>
-            </w:tcMar>
-          </w:tcPr>
-          <w:p>
-            <w:pPr>
-              <w:spacing w:after="0"/>
-            </w:pPr>
-            <w:r>
-              <w:rPr>
-                <w:rFonts w:ascii="Calibri" w:cs="Calibri" w:eastAsia="Calibri" w:hAnsi="Calibri"/>
-                <w:b w:val="false"/>
-                <w:bCs w:val="false"/>
-                <w:color w:val="1F2937"/>
-                <w:sz w:val="18"/>
-                <w:szCs w:val="18"/>
-              </w:rPr>
-              <w:t xml:space="preserve">buildings, machinery, vehicles, computers, furniture (PP&amp;E asset-class mix fractions)</w:t>
+            <w:tcW w:type="pct" w:w="21%"/>
+            <w:shd w:fill="F3F4F6" w:color="F3F4F6" w:val="solid"/>
+            <w:tcMar>
+              <w:top w:type="dxa" w:w="40"/>
+              <w:left w:type="dxa" w:w="80"/>
+              <w:bottom w:type="dxa" w:w="40"/>
+              <w:right w:type="dxa" w:w="80"/>
+            </w:tcMar>
+          </w:tcPr>
+          <w:p>
+            <w:pPr>
+              <w:spacing w:after="0"/>
+            </w:pPr>
+            <w:r>
+              <w:rPr>
+                <w:rFonts w:ascii="Calibri" w:cs="Calibri" w:eastAsia="Calibri" w:hAnsi="Calibri"/>
+                <w:b w:val="false"/>
+                <w:bCs w:val="false"/>
+                <w:color w:val="1F2937"/>
+                <w:sz w:val="18"/>
+                <w:szCs w:val="18"/>
+              </w:rPr>
+              <w:t xml:space="preserve">Tax Loss Carryforward</w:t>
+            </w:r>
+          </w:p>
+        </w:tc>
+        <w:tc>
+          <w:tcPr>
+            <w:tcW w:type="pct" w:w="79%"/>
+            <w:shd w:fill="F3F4F6" w:color="F3F4F6" w:val="solid"/>
+            <w:tcMar>
+              <w:top w:type="dxa" w:w="40"/>
+              <w:left w:type="dxa" w:w="80"/>
+              <w:bottom w:type="dxa" w:w="40"/>
+              <w:right w:type="dxa" w:w="80"/>
+            </w:tcMar>
+          </w:tcPr>
+          <w:p>
+            <w:pPr>
+              <w:spacing w:after="0"/>
+            </w:pPr>
+            <w:r>
+              <w:rPr>
+                <w:rFonts w:ascii="Calibri" w:cs="Calibri" w:eastAsia="Calibri" w:hAnsi="Calibri"/>
+                <w:b w:val="false"/>
+                <w:bCs w:val="false"/>
+                <w:color w:val="1F2937"/>
+                <w:sz w:val="18"/>
+                <w:szCs w:val="18"/>
+              </w:rPr>
+              <w:t xml:space="preserve">enableTaxLossCarryforward, taxLossCarryforwardYears (5) — Tax Law Art. 29</w:t>
             </w:r>
           </w:p>
         </w:tc>
@@ -3146,7 +3162,7 @@
       <w:tr>
         <w:tc>
           <w:tcPr>
-            <w:tcW w:type="pct" w:w="25%"/>
+            <w:tcW w:type="pct" w:w="21%"/>
             <w:shd w:fill="FFFFFF" w:color="FFFFFF" w:val="solid"/>
             <w:tcMar>
               <w:top w:type="dxa" w:w="40"/>
@@ -3168,13 +3184,593 @@
                 <w:sz w:val="18"/>
                 <w:szCs w:val="18"/>
               </w:rPr>
+              <w:t xml:space="preserve">Legal Reserve</w:t>
+            </w:r>
+          </w:p>
+        </w:tc>
+        <w:tc>
+          <w:tcPr>
+            <w:tcW w:type="pct" w:w="79%"/>
+            <w:shd w:fill="FFFFFF" w:color="FFFFFF" w:val="solid"/>
+            <w:tcMar>
+              <w:top w:type="dxa" w:w="40"/>
+              <w:left w:type="dxa" w:w="80"/>
+              <w:bottom w:type="dxa" w:w="40"/>
+              <w:right w:type="dxa" w:w="80"/>
+            </w:tcMar>
+          </w:tcPr>
+          <w:p>
+            <w:pPr>
+              <w:spacing w:after="0"/>
+            </w:pPr>
+            <w:r>
+              <w:rPr>
+                <w:rFonts w:ascii="Calibri" w:cs="Calibri" w:eastAsia="Calibri" w:hAnsi="Calibri"/>
+                <w:b w:val="false"/>
+                <w:bCs w:val="false"/>
+                <w:color w:val="1F2937"/>
+                <w:sz w:val="18"/>
+                <w:szCs w:val="18"/>
+              </w:rPr>
+              <w:t xml:space="preserve">enableLegalReserve, legalReservePercent (5%), paidUpCapital, legalReserveCap (50%), initialLegalReserve — Companies Law Art. 40</w:t>
+            </w:r>
+          </w:p>
+        </w:tc>
+      </w:tr>
+      <w:tr>
+        <w:tc>
+          <w:tcPr>
+            <w:tcW w:type="pct" w:w="21%"/>
+            <w:shd w:fill="F3F4F6" w:color="F3F4F6" w:val="solid"/>
+            <w:tcMar>
+              <w:top w:type="dxa" w:w="40"/>
+              <w:left w:type="dxa" w:w="80"/>
+              <w:bottom w:type="dxa" w:w="40"/>
+              <w:right w:type="dxa" w:w="80"/>
+            </w:tcMar>
+          </w:tcPr>
+          <w:p>
+            <w:pPr>
+              <w:spacing w:after="0"/>
+            </w:pPr>
+            <w:r>
+              <w:rPr>
+                <w:rFonts w:ascii="Calibri" w:cs="Calibri" w:eastAsia="Calibri" w:hAnsi="Calibri"/>
+                <w:b w:val="false"/>
+                <w:bCs w:val="false"/>
+                <w:color w:val="1F2937"/>
+                <w:sz w:val="18"/>
+                <w:szCs w:val="18"/>
+              </w:rPr>
+              <w:t xml:space="preserve">Dividend WHT</w:t>
+            </w:r>
+          </w:p>
+        </w:tc>
+        <w:tc>
+          <w:tcPr>
+            <w:tcW w:type="pct" w:w="79%"/>
+            <w:shd w:fill="F3F4F6" w:color="F3F4F6" w:val="solid"/>
+            <w:tcMar>
+              <w:top w:type="dxa" w:w="40"/>
+              <w:left w:type="dxa" w:w="80"/>
+              <w:bottom w:type="dxa" w:w="40"/>
+              <w:right w:type="dxa" w:w="80"/>
+            </w:tcMar>
+          </w:tcPr>
+          <w:p>
+            <w:pPr>
+              <w:spacing w:after="0"/>
+            </w:pPr>
+            <w:r>
+              <w:rPr>
+                <w:rFonts w:ascii="Calibri" w:cs="Calibri" w:eastAsia="Calibri" w:hAnsi="Calibri"/>
+                <w:b w:val="false"/>
+                <w:bCs w:val="false"/>
+                <w:color w:val="1F2937"/>
+                <w:sz w:val="18"/>
+                <w:szCs w:val="18"/>
+              </w:rPr>
+              <w:t xml:space="preserve">dividendWithholdingTaxRate (10% unlisted / 5% EGX-listed), isEGXListed — Law 30/2023</w:t>
+            </w:r>
+          </w:p>
+        </w:tc>
+      </w:tr>
+      <w:tr>
+        <w:tc>
+          <w:tcPr>
+            <w:tcW w:type="pct" w:w="21%"/>
+            <w:shd w:fill="FFFFFF" w:color="FFFFFF" w:val="solid"/>
+            <w:tcMar>
+              <w:top w:type="dxa" w:w="40"/>
+              <w:left w:type="dxa" w:w="80"/>
+              <w:bottom w:type="dxa" w:w="40"/>
+              <w:right w:type="dxa" w:w="80"/>
+            </w:tcMar>
+          </w:tcPr>
+          <w:p>
+            <w:pPr>
+              <w:spacing w:after="0"/>
+            </w:pPr>
+            <w:r>
+              <w:rPr>
+                <w:rFonts w:ascii="Calibri" w:cs="Calibri" w:eastAsia="Calibri" w:hAnsi="Calibri"/>
+                <w:b w:val="false"/>
+                <w:bCs w:val="false"/>
+                <w:color w:val="1F2937"/>
+                <w:sz w:val="18"/>
+                <w:szCs w:val="18"/>
+              </w:rPr>
+              <w:t xml:space="preserve">End of Service</w:t>
+            </w:r>
+          </w:p>
+        </w:tc>
+        <w:tc>
+          <w:tcPr>
+            <w:tcW w:type="pct" w:w="79%"/>
+            <w:shd w:fill="FFFFFF" w:color="FFFFFF" w:val="solid"/>
+            <w:tcMar>
+              <w:top w:type="dxa" w:w="40"/>
+              <w:left w:type="dxa" w:w="80"/>
+              <w:bottom w:type="dxa" w:w="40"/>
+              <w:right w:type="dxa" w:w="80"/>
+            </w:tcMar>
+          </w:tcPr>
+          <w:p>
+            <w:pPr>
+              <w:spacing w:after="0"/>
+            </w:pPr>
+            <w:r>
+              <w:rPr>
+                <w:rFonts w:ascii="Calibri" w:cs="Calibri" w:eastAsia="Calibri" w:hAnsi="Calibri"/>
+                <w:b w:val="false"/>
+                <w:bCs w:val="false"/>
+                <w:color w:val="1F2937"/>
+                <w:sz w:val="18"/>
+                <w:szCs w:val="18"/>
+              </w:rPr>
+              <w:t xml:space="preserve">enableEndOfServiceBenefit, averageMonthlyBasicSalary, numberOfEmployees[] — Labor Law + EAS 38</w:t>
+            </w:r>
+          </w:p>
+        </w:tc>
+      </w:tr>
+      <w:tr>
+        <w:tc>
+          <w:tcPr>
+            <w:tcW w:type="pct" w:w="21%"/>
+            <w:shd w:fill="F3F4F6" w:color="F3F4F6" w:val="solid"/>
+            <w:tcMar>
+              <w:top w:type="dxa" w:w="40"/>
+              <w:left w:type="dxa" w:w="80"/>
+              <w:bottom w:type="dxa" w:w="40"/>
+              <w:right w:type="dxa" w:w="80"/>
+            </w:tcMar>
+          </w:tcPr>
+          <w:p>
+            <w:pPr>
+              <w:spacing w:after="0"/>
+            </w:pPr>
+            <w:r>
+              <w:rPr>
+                <w:rFonts w:ascii="Calibri" w:cs="Calibri" w:eastAsia="Calibri" w:hAnsi="Calibri"/>
+                <w:b w:val="false"/>
+                <w:bCs w:val="false"/>
+                <w:color w:val="1F2937"/>
+                <w:sz w:val="18"/>
+                <w:szCs w:val="18"/>
+              </w:rPr>
+              <w:t xml:space="preserve">DCF / Valuation</w:t>
+            </w:r>
+          </w:p>
+        </w:tc>
+        <w:tc>
+          <w:tcPr>
+            <w:tcW w:type="pct" w:w="79%"/>
+            <w:shd w:fill="F3F4F6" w:color="F3F4F6" w:val="solid"/>
+            <w:tcMar>
+              <w:top w:type="dxa" w:w="40"/>
+              <w:left w:type="dxa" w:w="80"/>
+              <w:bottom w:type="dxa" w:w="40"/>
+              <w:right w:type="dxa" w:w="80"/>
+            </w:tcMar>
+          </w:tcPr>
+          <w:p>
+            <w:pPr>
+              <w:spacing w:after="0"/>
+            </w:pPr>
+            <w:r>
+              <w:rPr>
+                <w:rFonts w:ascii="Calibri" w:cs="Calibri" w:eastAsia="Calibri" w:hAnsi="Calibri"/>
+                <w:b w:val="false"/>
+                <w:bCs w:val="false"/>
+                <w:color w:val="1F2937"/>
+                <w:sz w:val="18"/>
+                <w:szCs w:val="18"/>
+              </w:rPr>
+              <w:t xml:space="preserve">riskFreeRate (20%), beta (1.0), equityRiskPremium (10.5%), terminalGrowthRate (7%), sharePrice (optional)</w:t>
+            </w:r>
+          </w:p>
+        </w:tc>
+      </w:tr>
+      <w:tr>
+        <w:tc>
+          <w:tcPr>
+            <w:tcW w:type="pct" w:w="21%"/>
+            <w:shd w:fill="FFFFFF" w:color="FFFFFF" w:val="solid"/>
+            <w:tcMar>
+              <w:top w:type="dxa" w:w="40"/>
+              <w:left w:type="dxa" w:w="80"/>
+              <w:bottom w:type="dxa" w:w="40"/>
+              <w:right w:type="dxa" w:w="80"/>
+            </w:tcMar>
+          </w:tcPr>
+          <w:p>
+            <w:pPr>
+              <w:spacing w:after="0"/>
+            </w:pPr>
+            <w:r>
+              <w:rPr>
+                <w:rFonts w:ascii="Calibri" w:cs="Calibri" w:eastAsia="Calibri" w:hAnsi="Calibri"/>
+                <w:b w:val="false"/>
+                <w:bCs w:val="false"/>
+                <w:color w:val="1F2937"/>
+                <w:sz w:val="18"/>
+                <w:szCs w:val="18"/>
+              </w:rPr>
+              <w:t xml:space="preserve">Inflation</w:t>
+            </w:r>
+          </w:p>
+        </w:tc>
+        <w:tc>
+          <w:tcPr>
+            <w:tcW w:type="pct" w:w="79%"/>
+            <w:shd w:fill="FFFFFF" w:color="FFFFFF" w:val="solid"/>
+            <w:tcMar>
+              <w:top w:type="dxa" w:w="40"/>
+              <w:left w:type="dxa" w:w="80"/>
+              <w:bottom w:type="dxa" w:w="40"/>
+              <w:right w:type="dxa" w:w="80"/>
+            </w:tcMar>
+          </w:tcPr>
+          <w:p>
+            <w:pPr>
+              <w:spacing w:after="0"/>
+            </w:pPr>
+            <w:r>
+              <w:rPr>
+                <w:rFonts w:ascii="Calibri" w:cs="Calibri" w:eastAsia="Calibri" w:hAnsi="Calibri"/>
+                <w:b w:val="false"/>
+                <w:bCs w:val="false"/>
+                <w:color w:val="1F2937"/>
+                <w:sz w:val="18"/>
+                <w:szCs w:val="18"/>
+              </w:rPr>
+              <w:t xml:space="preserve">inflationRate[] ([25%,18%,14%,10%,8%]), linkRevenueToInflation</w:t>
+            </w:r>
+          </w:p>
+        </w:tc>
+      </w:tr>
+      <w:tr>
+        <w:tc>
+          <w:tcPr>
+            <w:tcW w:type="pct" w:w="21%"/>
+            <w:shd w:fill="F3F4F6" w:color="F3F4F6" w:val="solid"/>
+            <w:tcMar>
+              <w:top w:type="dxa" w:w="40"/>
+              <w:left w:type="dxa" w:w="80"/>
+              <w:bottom w:type="dxa" w:w="40"/>
+              <w:right w:type="dxa" w:w="80"/>
+            </w:tcMar>
+          </w:tcPr>
+          <w:p>
+            <w:pPr>
+              <w:spacing w:after="0"/>
+            </w:pPr>
+            <w:r>
+              <w:rPr>
+                <w:rFonts w:ascii="Calibri" w:cs="Calibri" w:eastAsia="Calibri" w:hAnsi="Calibri"/>
+                <w:b w:val="false"/>
+                <w:bCs w:val="false"/>
+                <w:color w:val="1F2937"/>
+                <w:sz w:val="18"/>
+                <w:szCs w:val="18"/>
+              </w:rPr>
+              <w:t xml:space="preserve">Sector Preset</w:t>
+            </w:r>
+          </w:p>
+        </w:tc>
+        <w:tc>
+          <w:tcPr>
+            <w:tcW w:type="pct" w:w="79%"/>
+            <w:shd w:fill="F3F4F6" w:color="F3F4F6" w:val="solid"/>
+            <w:tcMar>
+              <w:top w:type="dxa" w:w="40"/>
+              <w:left w:type="dxa" w:w="80"/>
+              <w:bottom w:type="dxa" w:w="40"/>
+              <w:right w:type="dxa" w:w="80"/>
+            </w:tcMar>
+          </w:tcPr>
+          <w:p>
+            <w:pPr>
+              <w:spacing w:after="0"/>
+            </w:pPr>
+            <w:r>
+              <w:rPr>
+                <w:rFonts w:ascii="Calibri" w:cs="Calibri" w:eastAsia="Calibri" w:hAnsi="Calibri"/>
+                <w:b w:val="false"/>
+                <w:bCs w:val="false"/>
+                <w:color w:val="1F2937"/>
+                <w:sz w:val="18"/>
+                <w:szCs w:val="18"/>
+              </w:rPr>
+              <w:t xml:space="preserve">sectorPreset (technology|manufacturing|retail|government-contractor|export-oriented|real-estate|custom)</w:t>
+            </w:r>
+          </w:p>
+        </w:tc>
+      </w:tr>
+      <w:tr>
+        <w:tc>
+          <w:tcPr>
+            <w:tcW w:type="pct" w:w="21%"/>
+            <w:shd w:fill="FFFFFF" w:color="FFFFFF" w:val="solid"/>
+            <w:tcMar>
+              <w:top w:type="dxa" w:w="40"/>
+              <w:left w:type="dxa" w:w="80"/>
+              <w:bottom w:type="dxa" w:w="40"/>
+              <w:right w:type="dxa" w:w="80"/>
+            </w:tcMar>
+          </w:tcPr>
+          <w:p>
+            <w:pPr>
+              <w:spacing w:after="0"/>
+            </w:pPr>
+            <w:r>
+              <w:rPr>
+                <w:rFonts w:ascii="Calibri" w:cs="Calibri" w:eastAsia="Calibri" w:hAnsi="Calibri"/>
+                <w:b w:val="false"/>
+                <w:bCs w:val="false"/>
+                <w:color w:val="1F2937"/>
+                <w:sz w:val="18"/>
+                <w:szCs w:val="18"/>
+              </w:rPr>
+              <w:t xml:space="preserve">Asset Mix</w:t>
+            </w:r>
+          </w:p>
+        </w:tc>
+        <w:tc>
+          <w:tcPr>
+            <w:tcW w:type="pct" w:w="79%"/>
+            <w:shd w:fill="FFFFFF" w:color="FFFFFF" w:val="solid"/>
+            <w:tcMar>
+              <w:top w:type="dxa" w:w="40"/>
+              <w:left w:type="dxa" w:w="80"/>
+              <w:bottom w:type="dxa" w:w="40"/>
+              <w:right w:type="dxa" w:w="80"/>
+            </w:tcMar>
+          </w:tcPr>
+          <w:p>
+            <w:pPr>
+              <w:spacing w:after="0"/>
+            </w:pPr>
+            <w:r>
+              <w:rPr>
+                <w:rFonts w:ascii="Calibri" w:cs="Calibri" w:eastAsia="Calibri" w:hAnsi="Calibri"/>
+                <w:b w:val="false"/>
+                <w:bCs w:val="false"/>
+                <w:color w:val="1F2937"/>
+                <w:sz w:val="18"/>
+                <w:szCs w:val="18"/>
+              </w:rPr>
+              <w:t xml:space="preserve">assetMix.buildings (30%), .machinery (35%), .vehicles (15%), .computers (10%), .furniture (10%)</w:t>
+            </w:r>
+          </w:p>
+        </w:tc>
+      </w:tr>
+      <w:tr>
+        <w:tc>
+          <w:tcPr>
+            <w:tcW w:type="pct" w:w="21%"/>
+            <w:shd w:fill="F3F4F6" w:color="F3F4F6" w:val="solid"/>
+            <w:tcMar>
+              <w:top w:type="dxa" w:w="40"/>
+              <w:left w:type="dxa" w:w="80"/>
+              <w:bottom w:type="dxa" w:w="40"/>
+              <w:right w:type="dxa" w:w="80"/>
+            </w:tcMar>
+          </w:tcPr>
+          <w:p>
+            <w:pPr>
+              <w:spacing w:after="0"/>
+            </w:pPr>
+            <w:r>
+              <w:rPr>
+                <w:rFonts w:ascii="Calibri" w:cs="Calibri" w:eastAsia="Calibri" w:hAnsi="Calibri"/>
+                <w:b w:val="false"/>
+                <w:bCs w:val="false"/>
+                <w:color w:val="1F2937"/>
+                <w:sz w:val="18"/>
+                <w:szCs w:val="18"/>
+              </w:rPr>
+              <w:t xml:space="preserve">Egyptian Preset</w:t>
+            </w:r>
+          </w:p>
+        </w:tc>
+        <w:tc>
+          <w:tcPr>
+            <w:tcW w:type="pct" w:w="79%"/>
+            <w:shd w:fill="F3F4F6" w:color="F3F4F6" w:val="solid"/>
+            <w:tcMar>
+              <w:top w:type="dxa" w:w="40"/>
+              <w:left w:type="dxa" w:w="80"/>
+              <w:bottom w:type="dxa" w:w="40"/>
+              <w:right w:type="dxa" w:w="80"/>
+            </w:tcMar>
+          </w:tcPr>
+          <w:p>
+            <w:pPr>
+              <w:spacing w:after="0"/>
+            </w:pPr>
+            <w:r>
+              <w:rPr>
+                <w:rFonts w:ascii="Calibri" w:cs="Calibri" w:eastAsia="Calibri" w:hAnsi="Calibri"/>
+                <w:b w:val="false"/>
+                <w:bCs w:val="false"/>
+                <w:color w:val="1F2937"/>
+                <w:sz w:val="18"/>
+                <w:szCs w:val="18"/>
+              </w:rPr>
+              <w:t xml:space="preserve">countryPreset, useEgyptianRates, dividendWithholdingRate, fiscalYearEnd, fiscalYearPreset</w:t>
+            </w:r>
+          </w:p>
+        </w:tc>
+      </w:tr>
+      <w:tr>
+        <w:tc>
+          <w:tcPr>
+            <w:tcW w:type="pct" w:w="21%"/>
+            <w:shd w:fill="FFFFFF" w:color="FFFFFF" w:val="solid"/>
+            <w:tcMar>
+              <w:top w:type="dxa" w:w="40"/>
+              <w:left w:type="dxa" w:w="80"/>
+              <w:bottom w:type="dxa" w:w="40"/>
+              <w:right w:type="dxa" w:w="80"/>
+            </w:tcMar>
+          </w:tcPr>
+          <w:p>
+            <w:pPr>
+              <w:spacing w:after="0"/>
+            </w:pPr>
+            <w:r>
+              <w:rPr>
+                <w:rFonts w:ascii="Calibri" w:cs="Calibri" w:eastAsia="Calibri" w:hAnsi="Calibri"/>
+                <w:b w:val="false"/>
+                <w:bCs w:val="false"/>
+                <w:color w:val="1F2937"/>
+                <w:sz w:val="18"/>
+                <w:szCs w:val="18"/>
+              </w:rPr>
+              <w:t xml:space="preserve">Other BS Items</w:t>
+            </w:r>
+          </w:p>
+        </w:tc>
+        <w:tc>
+          <w:tcPr>
+            <w:tcW w:type="pct" w:w="79%"/>
+            <w:shd w:fill="FFFFFF" w:color="FFFFFF" w:val="solid"/>
+            <w:tcMar>
+              <w:top w:type="dxa" w:w="40"/>
+              <w:left w:type="dxa" w:w="80"/>
+              <w:bottom w:type="dxa" w:w="40"/>
+              <w:right w:type="dxa" w:w="80"/>
+            </w:tcMar>
+          </w:tcPr>
+          <w:p>
+            <w:pPr>
+              <w:spacing w:after="0"/>
+            </w:pPr>
+            <w:r>
+              <w:rPr>
+                <w:rFonts w:ascii="Calibri" w:cs="Calibri" w:eastAsia="Calibri" w:hAnsi="Calibri"/>
+                <w:b w:val="false"/>
+                <w:bCs w:val="false"/>
+                <w:color w:val="1F2937"/>
+                <w:sz w:val="18"/>
+                <w:szCs w:val="18"/>
+              </w:rPr>
+              <w:t xml:space="preserve">goodwill[], otherLongTermAssets[], otherCurrentAssets[], otherCurrentLiabilities[], deferredTaxLiabilities[], otherLongTermLiabilities[]</w:t>
+            </w:r>
+          </w:p>
+        </w:tc>
+      </w:tr>
+      <w:tr>
+        <w:tc>
+          <w:tcPr>
+            <w:tcW w:type="pct" w:w="21%"/>
+            <w:shd w:fill="F3F4F6" w:color="F3F4F6" w:val="solid"/>
+            <w:tcMar>
+              <w:top w:type="dxa" w:w="40"/>
+              <w:left w:type="dxa" w:w="80"/>
+              <w:bottom w:type="dxa" w:w="40"/>
+              <w:right w:type="dxa" w:w="80"/>
+            </w:tcMar>
+          </w:tcPr>
+          <w:p>
+            <w:pPr>
+              <w:spacing w:after="0"/>
+            </w:pPr>
+            <w:r>
+              <w:rPr>
+                <w:rFonts w:ascii="Calibri" w:cs="Calibri" w:eastAsia="Calibri" w:hAnsi="Calibri"/>
+                <w:b w:val="false"/>
+                <w:bCs w:val="false"/>
+                <w:color w:val="1F2937"/>
+                <w:sz w:val="18"/>
+                <w:szCs w:val="18"/>
+              </w:rPr>
+              <w:t xml:space="preserve">Investing</w:t>
+            </w:r>
+          </w:p>
+        </w:tc>
+        <w:tc>
+          <w:tcPr>
+            <w:tcW w:type="pct" w:w="79%"/>
+            <w:shd w:fill="F3F4F6" w:color="F3F4F6" w:val="solid"/>
+            <w:tcMar>
+              <w:top w:type="dxa" w:w="40"/>
+              <w:left w:type="dxa" w:w="80"/>
+              <w:bottom w:type="dxa" w:w="40"/>
+              <w:right w:type="dxa" w:w="80"/>
+            </w:tcMar>
+          </w:tcPr>
+          <w:p>
+            <w:pPr>
+              <w:spacing w:after="0"/>
+            </w:pPr>
+            <w:r>
+              <w:rPr>
+                <w:rFonts w:ascii="Calibri" w:cs="Calibri" w:eastAsia="Calibri" w:hAnsi="Calibri"/>
+                <w:b w:val="false"/>
+                <w:bCs w:val="false"/>
+                <w:color w:val="1F2937"/>
+                <w:sz w:val="18"/>
+                <w:szCs w:val="18"/>
+              </w:rPr>
+              <w:t xml:space="preserve">acquisitions[], assetSales[], investmentPurchases[], investmentSales[]</w:t>
+            </w:r>
+          </w:p>
+        </w:tc>
+      </w:tr>
+      <w:tr>
+        <w:tc>
+          <w:tcPr>
+            <w:tcW w:type="pct" w:w="21%"/>
+            <w:shd w:fill="FFFFFF" w:color="FFFFFF" w:val="solid"/>
+            <w:tcMar>
+              <w:top w:type="dxa" w:w="40"/>
+              <w:left w:type="dxa" w:w="80"/>
+              <w:bottom w:type="dxa" w:w="40"/>
+              <w:right w:type="dxa" w:w="80"/>
+            </w:tcMar>
+          </w:tcPr>
+          <w:p>
+            <w:pPr>
+              <w:spacing w:after="0"/>
+            </w:pPr>
+            <w:r>
+              <w:rPr>
+                <w:rFonts w:ascii="Calibri" w:cs="Calibri" w:eastAsia="Calibri" w:hAnsi="Calibri"/>
+                <w:b w:val="false"/>
+                <w:bCs w:val="false"/>
+                <w:color w:val="1F2937"/>
+                <w:sz w:val="18"/>
+                <w:szCs w:val="18"/>
+              </w:rPr>
               <w:t xml:space="preserve">Model Config</w:t>
             </w:r>
           </w:p>
         </w:tc>
         <w:tc>
           <w:tcPr>
-            <w:tcW w:type="pct" w:w="75%"/>
+            <w:tcW w:type="pct" w:w="79%"/>
             <w:shd w:fill="FFFFFF" w:color="FFFFFF" w:val="solid"/>
             <w:tcMar>
               <w:top w:type="dxa" w:w="40"/>
@@ -3196,7 +3792,7 @@
                 <w:sz w:val="18"/>
                 <w:szCs w:val="18"/>
               </w:rPr>
-              <w:t xml:space="preserve">projectionYears, historicalYears, startYear, fiscalYearEnd, fiscalYearPreset</w:t>
+              <w:t xml:space="preserve">projectionYears (5), historicalYears (2), startYear (2026), fiscalYearEnd (6=June)</w:t>
             </w:r>
           </w:p>
         </w:tc>
@@ -3218,7 +3814,7 @@
           <w:sz w:val="20"/>
           <w:szCs w:val="20"/>
         </w:rPr>
-        <w:t xml:space="preserve">Also provides getDefaultAssumptions() with 5 projection-year demo data and getDefaultHistoricalInputs() with balanced 2-year demo historical data.</w:t>
+        <w:t xml:space="preserve">getDefaultAssumptions() → Egyptian-market defaults with CBE-linked rates. getDefaultHistoricalInputs() → 2-period (2024/2025) balanced demo data with RE calculated as plug.</w:t>
       </w:r>
     </w:p>
     <w:p>
@@ -11662,7 +12258,7 @@
           <w:sz w:val="32"/>
           <w:szCs w:val="32"/>
         </w:rPr>
-        <w:t xml:space="preserve">7. State Management (store.ts)</w:t>
+        <w:t xml:space="preserve">7. State Management (store.ts) — 548 lines</w:t>
       </w:r>
     </w:p>
     <w:p>
@@ -11681,7 +12277,7 @@
           <w:sz w:val="20"/>
           <w:szCs w:val="20"/>
         </w:rPr>
-        <w:t xml:space="preserve">Zustand store with localStorage persistence via zustand/middleware/persist. 396 lines of code with 15+ actions:</w:t>
+        <w:t xml:space="preserve">Zustand store (v4) with localStorage persistence via zustand/middleware/persist. 20+ actions with GLOBAL_KEYS sync:</w:t>
       </w:r>
     </w:p>
     <w:tbl>
@@ -12162,7 +12758,7 @@
                 <w:sz w:val="18"/>
                 <w:szCs w:val="18"/>
               </w:rPr>
-              <w:t xml:space="preserve">Current navigation tab (15 possible values)</w:t>
+              <w:t xml:space="preserve">Current navigation tab (19 possible values)</w:t>
             </w:r>
           </w:p>
         </w:tc>
@@ -12278,7 +12874,7 @@
                 <w:sz w:val="18"/>
                 <w:szCs w:val="18"/>
               </w:rPr>
-              <w:t xml:space="preserve">Assumption change history for undo/redo</w:t>
+              <w:t xml:space="preserve">Assumption change history for undo/redo (50-entry cap)</w:t>
             </w:r>
           </w:p>
         </w:tc>
@@ -12337,6 +12933,296 @@
                 <w:szCs w:val="18"/>
               </w:rPr>
               <w:t xml:space="preserve">Current validation messages</w:t>
+            </w:r>
+          </w:p>
+        </w:tc>
+      </w:tr>
+      <w:tr>
+        <w:tc>
+          <w:tcPr>
+            <w:tcW w:type="pct" w:w="35%"/>
+            <w:shd w:fill="F3F4F6" w:color="F3F4F6" w:val="solid"/>
+            <w:tcMar>
+              <w:top w:type="dxa" w:w="40"/>
+              <w:left w:type="dxa" w:w="80"/>
+              <w:bottom w:type="dxa" w:w="40"/>
+              <w:right w:type="dxa" w:w="80"/>
+            </w:tcMar>
+          </w:tcPr>
+          <w:p>
+            <w:pPr>
+              <w:spacing w:after="0"/>
+            </w:pPr>
+            <w:r>
+              <w:rPr>
+                <w:rFonts w:ascii="Calibri" w:cs="Calibri" w:eastAsia="Calibri" w:hAnsi="Calibri"/>
+                <w:b w:val="false"/>
+                <w:bCs w:val="false"/>
+                <w:color w:val="1F2937"/>
+                <w:sz w:val="18"/>
+                <w:szCs w:val="18"/>
+              </w:rPr>
+              <w:t xml:space="preserve">calculationError</w:t>
+            </w:r>
+          </w:p>
+        </w:tc>
+        <w:tc>
+          <w:tcPr>
+            <w:tcW w:type="pct" w:w="65%"/>
+            <w:shd w:fill="F3F4F6" w:color="F3F4F6" w:val="solid"/>
+            <w:tcMar>
+              <w:top w:type="dxa" w:w="40"/>
+              <w:left w:type="dxa" w:w="80"/>
+              <w:bottom w:type="dxa" w:w="40"/>
+              <w:right w:type="dxa" w:w="80"/>
+            </w:tcMar>
+          </w:tcPr>
+          <w:p>
+            <w:pPr>
+              <w:spacing w:after="0"/>
+            </w:pPr>
+            <w:r>
+              <w:rPr>
+                <w:rFonts w:ascii="Calibri" w:cs="Calibri" w:eastAsia="Calibri" w:hAnsi="Calibri"/>
+                <w:b w:val="false"/>
+                <w:bCs w:val="false"/>
+                <w:color w:val="1F2937"/>
+                <w:sz w:val="18"/>
+                <w:szCs w:val="18"/>
+              </w:rPr>
+              <w:t xml:space="preserve">Error message from last failed calculation</w:t>
+            </w:r>
+          </w:p>
+        </w:tc>
+      </w:tr>
+      <w:tr>
+        <w:tc>
+          <w:tcPr>
+            <w:tcW w:type="pct" w:w="35%"/>
+            <w:shd w:fill="FFFFFF" w:color="FFFFFF" w:val="solid"/>
+            <w:tcMar>
+              <w:top w:type="dxa" w:w="40"/>
+              <w:left w:type="dxa" w:w="80"/>
+              <w:bottom w:type="dxa" w:w="40"/>
+              <w:right w:type="dxa" w:w="80"/>
+            </w:tcMar>
+          </w:tcPr>
+          <w:p>
+            <w:pPr>
+              <w:spacing w:after="0"/>
+            </w:pPr>
+            <w:r>
+              <w:rPr>
+                <w:rFonts w:ascii="Calibri" w:cs="Calibri" w:eastAsia="Calibri" w:hAnsi="Calibri"/>
+                <w:b w:val="false"/>
+                <w:bCs w:val="false"/>
+                <w:color w:val="1F2937"/>
+                <w:sz w:val="18"/>
+                <w:szCs w:val="18"/>
+              </w:rPr>
+              <w:t xml:space="preserve">cellOverrides</w:t>
+            </w:r>
+          </w:p>
+        </w:tc>
+        <w:tc>
+          <w:tcPr>
+            <w:tcW w:type="pct" w:w="65%"/>
+            <w:shd w:fill="FFFFFF" w:color="FFFFFF" w:val="solid"/>
+            <w:tcMar>
+              <w:top w:type="dxa" w:w="40"/>
+              <w:left w:type="dxa" w:w="80"/>
+              <w:bottom w:type="dxa" w:w="40"/>
+              <w:right w:type="dxa" w:w="80"/>
+            </w:tcMar>
+          </w:tcPr>
+          <w:p>
+            <w:pPr>
+              <w:spacing w:after="0"/>
+            </w:pPr>
+            <w:r>
+              <w:rPr>
+                <w:rFonts w:ascii="Calibri" w:cs="Calibri" w:eastAsia="Calibri" w:hAnsi="Calibri"/>
+                <w:b w:val="false"/>
+                <w:bCs w:val="false"/>
+                <w:color w:val="1F2937"/>
+                <w:sz w:val="18"/>
+                <w:szCs w:val="18"/>
+              </w:rPr>
+              <w:t xml:space="preserve">Manual cell value overrides keyed by scenarioId_rowKey_period</w:t>
+            </w:r>
+          </w:p>
+        </w:tc>
+      </w:tr>
+      <w:tr>
+        <w:tc>
+          <w:tcPr>
+            <w:tcW w:type="pct" w:w="35%"/>
+            <w:shd w:fill="F3F4F6" w:color="F3F4F6" w:val="solid"/>
+            <w:tcMar>
+              <w:top w:type="dxa" w:w="40"/>
+              <w:left w:type="dxa" w:w="80"/>
+              <w:bottom w:type="dxa" w:w="40"/>
+              <w:right w:type="dxa" w:w="80"/>
+            </w:tcMar>
+          </w:tcPr>
+          <w:p>
+            <w:pPr>
+              <w:spacing w:after="0"/>
+            </w:pPr>
+            <w:r>
+              <w:rPr>
+                <w:rFonts w:ascii="Calibri" w:cs="Calibri" w:eastAsia="Calibri" w:hAnsi="Calibri"/>
+                <w:b w:val="false"/>
+                <w:bCs w:val="false"/>
+                <w:color w:val="1F2937"/>
+                <w:sz w:val="18"/>
+                <w:szCs w:val="18"/>
+              </w:rPr>
+              <w:t xml:space="preserve">dataVersion</w:t>
+            </w:r>
+          </w:p>
+        </w:tc>
+        <w:tc>
+          <w:tcPr>
+            <w:tcW w:type="pct" w:w="65%"/>
+            <w:shd w:fill="F3F4F6" w:color="F3F4F6" w:val="solid"/>
+            <w:tcMar>
+              <w:top w:type="dxa" w:w="40"/>
+              <w:left w:type="dxa" w:w="80"/>
+              <w:bottom w:type="dxa" w:w="40"/>
+              <w:right w:type="dxa" w:w="80"/>
+            </w:tcMar>
+          </w:tcPr>
+          <w:p>
+            <w:pPr>
+              <w:spacing w:after="0"/>
+            </w:pPr>
+            <w:r>
+              <w:rPr>
+                <w:rFonts w:ascii="Calibri" w:cs="Calibri" w:eastAsia="Calibri" w:hAnsi="Calibri"/>
+                <w:b w:val="false"/>
+                <w:bCs w:val="false"/>
+                <w:color w:val="1F2937"/>
+                <w:sz w:val="18"/>
+                <w:szCs w:val="18"/>
+              </w:rPr>
+              <w:t xml:space="preserve">Incremented on each recalculation for change detection</w:t>
+            </w:r>
+          </w:p>
+        </w:tc>
+      </w:tr>
+      <w:tr>
+        <w:tc>
+          <w:tcPr>
+            <w:tcW w:type="pct" w:w="35%"/>
+            <w:shd w:fill="FFFFFF" w:color="FFFFFF" w:val="solid"/>
+            <w:tcMar>
+              <w:top w:type="dxa" w:w="40"/>
+              <w:left w:type="dxa" w:w="80"/>
+              <w:bottom w:type="dxa" w:w="40"/>
+              <w:right w:type="dxa" w:w="80"/>
+            </w:tcMar>
+          </w:tcPr>
+          <w:p>
+            <w:pPr>
+              <w:spacing w:after="0"/>
+            </w:pPr>
+            <w:r>
+              <w:rPr>
+                <w:rFonts w:ascii="Calibri" w:cs="Calibri" w:eastAsia="Calibri" w:hAnsi="Calibri"/>
+                <w:b w:val="false"/>
+                <w:bCs w:val="false"/>
+                <w:color w:val="1F2937"/>
+                <w:sz w:val="18"/>
+                <w:szCs w:val="18"/>
+              </w:rPr>
+              <w:t xml:space="preserve">conflictDetected</w:t>
+            </w:r>
+          </w:p>
+        </w:tc>
+        <w:tc>
+          <w:tcPr>
+            <w:tcW w:type="pct" w:w="65%"/>
+            <w:shd w:fill="FFFFFF" w:color="FFFFFF" w:val="solid"/>
+            <w:tcMar>
+              <w:top w:type="dxa" w:w="40"/>
+              <w:left w:type="dxa" w:w="80"/>
+              <w:bottom w:type="dxa" w:w="40"/>
+              <w:right w:type="dxa" w:w="80"/>
+            </w:tcMar>
+          </w:tcPr>
+          <w:p>
+            <w:pPr>
+              <w:spacing w:after="0"/>
+            </w:pPr>
+            <w:r>
+              <w:rPr>
+                <w:rFonts w:ascii="Calibri" w:cs="Calibri" w:eastAsia="Calibri" w:hAnsi="Calibri"/>
+                <w:b w:val="false"/>
+                <w:bCs w:val="false"/>
+                <w:color w:val="1F2937"/>
+                <w:sz w:val="18"/>
+                <w:szCs w:val="18"/>
+              </w:rPr>
+              <w:t xml:space="preserve">Multi-tab localStorage conflict flag</w:t>
+            </w:r>
+          </w:p>
+        </w:tc>
+      </w:tr>
+      <w:tr>
+        <w:tc>
+          <w:tcPr>
+            <w:tcW w:type="pct" w:w="35%"/>
+            <w:shd w:fill="F3F4F6" w:color="F3F4F6" w:val="solid"/>
+            <w:tcMar>
+              <w:top w:type="dxa" w:w="40"/>
+              <w:left w:type="dxa" w:w="80"/>
+              <w:bottom w:type="dxa" w:w="40"/>
+              <w:right w:type="dxa" w:w="80"/>
+            </w:tcMar>
+          </w:tcPr>
+          <w:p>
+            <w:pPr>
+              <w:spacing w:after="0"/>
+            </w:pPr>
+            <w:r>
+              <w:rPr>
+                <w:rFonts w:ascii="Calibri" w:cs="Calibri" w:eastAsia="Calibri" w:hAnsi="Calibri"/>
+                <w:b w:val="false"/>
+                <w:bCs w:val="false"/>
+                <w:color w:val="1F2937"/>
+                <w:sz w:val="18"/>
+                <w:szCs w:val="18"/>
+              </w:rPr>
+              <w:t xml:space="preserve">sidebarOpen</w:t>
+            </w:r>
+          </w:p>
+        </w:tc>
+        <w:tc>
+          <w:tcPr>
+            <w:tcW w:type="pct" w:w="65%"/>
+            <w:shd w:fill="F3F4F6" w:color="F3F4F6" w:val="solid"/>
+            <w:tcMar>
+              <w:top w:type="dxa" w:w="40"/>
+              <w:left w:type="dxa" w:w="80"/>
+              <w:bottom w:type="dxa" w:w="40"/>
+              <w:right w:type="dxa" w:w="80"/>
+            </w:tcMar>
+          </w:tcPr>
+          <w:p>
+            <w:pPr>
+              <w:spacing w:after="0"/>
+            </w:pPr>
+            <w:r>
+              <w:rPr>
+                <w:rFonts w:ascii="Calibri" w:cs="Calibri" w:eastAsia="Calibri" w:hAnsi="Calibri"/>
+                <w:b w:val="false"/>
+                <w:bCs w:val="false"/>
+                <w:color w:val="1F2937"/>
+                <w:sz w:val="18"/>
+                <w:szCs w:val="18"/>
+              </w:rPr>
+              <w:t xml:space="preserve">Sidebar collapsed/expanded state</w:t>
             </w:r>
           </w:p>
         </w:tc>
@@ -12535,7 +13421,7 @@
                 <w:sz w:val="18"/>
                 <w:szCs w:val="18"/>
               </w:rPr>
-              <w:t xml:space="preserve">Set per-year data + automatically convert to engine format</w:t>
+              <w:t xml:space="preserve">Set per-year data → auto-convert to engine format → recalculate all scenarios</w:t>
             </w:r>
           </w:p>
         </w:tc>
@@ -12593,7 +13479,7 @@
                 <w:sz w:val="18"/>
                 <w:szCs w:val="18"/>
               </w:rPr>
-              <w:t xml:space="preserve">Update any assumption; handles nested paths like revenueGrowthRate[0]</w:t>
+              <w:t xml:space="preserve">Update any assumption; handles array indexing like revenueGrowthRate[0]</w:t>
             </w:r>
           </w:p>
         </w:tc>
@@ -12651,7 +13537,7 @@
                 <w:sz w:val="18"/>
                 <w:szCs w:val="18"/>
               </w:rPr>
-              <w:t xml:space="preserve">Create or remove scenarios</w:t>
+              <w:t xml:space="preserve">Create or remove scenarios (min 1 scenario enforced)</w:t>
             </w:r>
           </w:p>
         </w:tc>
@@ -12767,7 +13653,7 @@
                 <w:sz w:val="18"/>
                 <w:szCs w:val="18"/>
               </w:rPr>
-              <w:t xml:space="preserve">Runs runFullModel() for the active scenario and stores results</w:t>
+              <w:t xml:space="preserve">Runs runFullModel() for active scenario; captures warnings (&gt;95% margin, &lt;-50% NI)</w:t>
             </w:r>
           </w:p>
         </w:tc>
@@ -12825,7 +13711,7 @@
                 <w:sz w:val="18"/>
                 <w:szCs w:val="18"/>
               </w:rPr>
-              <w:t xml:space="preserve">Runs model for every scenario sequentially</w:t>
+              <w:t xml:space="preserve">Syncs GLOBAL_KEYS from Base Case → all scenarios, then runs model for each independently (failures don't block others)</w:t>
             </w:r>
           </w:p>
         </w:tc>
@@ -12883,7 +13769,7 @@
                 <w:sz w:val="18"/>
                 <w:szCs w:val="18"/>
               </w:rPr>
-              <w:t xml:space="preserve">Assumption-level undo/redo with unlimited stack depth</w:t>
+              <w:t xml:space="preserve">Assumption-level undo/redo → auto-recalculates after restore</w:t>
             </w:r>
           </w:p>
         </w:tc>
@@ -12999,7 +13885,7 @@
                 <w:sz w:val="18"/>
                 <w:szCs w:val="18"/>
               </w:rPr>
-              <w:t xml:space="preserve">Applies US / Egyptian / Custom tax, VAT, and depreciation defaults</w:t>
+              <w:t xml:space="preserve">Applies US / Egyptian / Custom tax, VAT, CBE rates, depreciation, fiscal year to ALL scenarios</w:t>
             </w:r>
           </w:p>
         </w:tc>
@@ -13029,7 +13915,7 @@
                 <w:sz w:val="18"/>
                 <w:szCs w:val="18"/>
               </w:rPr>
-              <w:t xml:space="preserve">toggleDarkMode()</w:t>
+              <w:t xml:space="preserve">setCellOverride()</w:t>
             </w:r>
           </w:p>
         </w:tc>
@@ -13057,7 +13943,7 @@
                 <w:sz w:val="18"/>
                 <w:szCs w:val="18"/>
               </w:rPr>
-              <w:t xml:space="preserve">Toggle dark/light mode</w:t>
+              <w:t xml:space="preserve">Manual cell value override for specific scenario/row/period</w:t>
             </w:r>
           </w:p>
         </w:tc>
@@ -13087,7 +13973,7 @@
                 <w:sz w:val="18"/>
                 <w:szCs w:val="18"/>
               </w:rPr>
-              <w:t xml:space="preserve">setActiveTab(tab)</w:t>
+              <w:t xml:space="preserve">dismissConflict()</w:t>
             </w:r>
           </w:p>
         </w:tc>
@@ -13115,12 +14001,289 @@
                 <w:sz w:val="18"/>
                 <w:szCs w:val="18"/>
               </w:rPr>
-              <w:t xml:space="preserve">Navigate to a different section</w:t>
+              <w:t xml:space="preserve">Dismiss multi-tab conflict notification</w:t>
+            </w:r>
+          </w:p>
+        </w:tc>
+      </w:tr>
+      <w:tr>
+        <w:tc>
+          <w:tcPr>
+            <w:tcW w:type="pct" w:w="35%"/>
+            <w:shd w:fill="F3F4F6" w:color="F3F4F6" w:val="solid"/>
+            <w:tcMar>
+              <w:top w:type="dxa" w:w="40"/>
+              <w:left w:type="dxa" w:w="80"/>
+              <w:bottom w:type="dxa" w:w="40"/>
+              <w:right w:type="dxa" w:w="80"/>
+            </w:tcMar>
+          </w:tcPr>
+          <w:p>
+            <w:pPr>
+              <w:spacing w:after="0"/>
+            </w:pPr>
+            <w:r>
+              <w:rPr>
+                <w:rFonts w:ascii="Calibri" w:cs="Calibri" w:eastAsia="Calibri" w:hAnsi="Calibri"/>
+                <w:b w:val="false"/>
+                <w:bCs w:val="false"/>
+                <w:color w:val="1F2937"/>
+                <w:sz w:val="18"/>
+                <w:szCs w:val="18"/>
+              </w:rPr>
+              <w:t xml:space="preserve">toggleDarkMode() / setSidebarOpen()</w:t>
+            </w:r>
+          </w:p>
+        </w:tc>
+        <w:tc>
+          <w:tcPr>
+            <w:tcW w:type="pct" w:w="65%"/>
+            <w:shd w:fill="F3F4F6" w:color="F3F4F6" w:val="solid"/>
+            <w:tcMar>
+              <w:top w:type="dxa" w:w="40"/>
+              <w:left w:type="dxa" w:w="80"/>
+              <w:bottom w:type="dxa" w:w="40"/>
+              <w:right w:type="dxa" w:w="80"/>
+            </w:tcMar>
+          </w:tcPr>
+          <w:p>
+            <w:pPr>
+              <w:spacing w:after="0"/>
+            </w:pPr>
+            <w:r>
+              <w:rPr>
+                <w:rFonts w:ascii="Calibri" w:cs="Calibri" w:eastAsia="Calibri" w:hAnsi="Calibri"/>
+                <w:b w:val="false"/>
+                <w:bCs w:val="false"/>
+                <w:color w:val="1F2937"/>
+                <w:sz w:val="18"/>
+                <w:szCs w:val="18"/>
+              </w:rPr>
+              <w:t xml:space="preserve">UI toggle actions</w:t>
             </w:r>
           </w:p>
         </w:tc>
       </w:tr>
     </w:tbl>
+    <w:p>
+      <w:pPr>
+        <w:pStyle w:val="Heading2"/>
+        <w:spacing w:before="280" w:after="80"/>
+      </w:pPr>
+      <w:r>
+        <w:rPr>
+          <w:rFonts w:ascii="Calibri" w:cs="Calibri" w:eastAsia="Calibri" w:hAnsi="Calibri"/>
+          <w:b/>
+          <w:bCs/>
+          <w:color w:val="1E3A8A"/>
+          <w:sz w:val="26"/>
+          <w:szCs w:val="26"/>
+        </w:rPr>
+        <w:t xml:space="preserve">7.1 GLOBAL_KEYS Sync</w:t>
+      </w:r>
+    </w:p>
+    <w:p>
+      <w:pPr>
+        <w:spacing w:after="80"/>
+        <w:jc w:val="left"/>
+      </w:pPr>
+      <w:r>
+        <w:rPr>
+          <w:rFonts w:ascii="Calibri" w:cs="Calibri" w:eastAsia="Calibri" w:hAnsi="Calibri"/>
+          <w:b w:val="false"/>
+          <w:bCs w:val="false"/>
+          <w:i w:val="false"/>
+          <w:iCs w:val="false"/>
+          <w:color w:val="1F2937"/>
+          <w:sz w:val="20"/>
+          <w:szCs w:val="20"/>
+        </w:rPr>
+        <w:t xml:space="preserve">calculateAllScenarios() syncs these keys from Base Case to all other scenarios before computing:</w:t>
+      </w:r>
+    </w:p>
+    <w:p>
+      <w:pPr>
+        <w:shd w:fill="F8F9FA" w:color="F8F9FA" w:val="solid"/>
+        <w:spacing w:after="20"/>
+        <w:ind w:left="360"/>
+      </w:pPr>
+      <w:r>
+        <w:rPr>
+          <w:rFonts w:ascii="Consolas" w:cs="Consolas" w:eastAsia="Consolas" w:hAnsi="Consolas"/>
+          <w:color w:val="3B82F6"/>
+          <w:sz w:val="18"/>
+          <w:szCs w:val="18"/>
+        </w:rPr>
+        <w:t xml:space="preserve">taxRate, taxRegime, vatRate, enableVAT, dividendWithholdingRate,</w:t>
+      </w:r>
+    </w:p>
+    <w:p>
+      <w:pPr>
+        <w:shd w:fill="F8F9FA" w:color="F8F9FA" w:val="solid"/>
+        <w:spacing w:after="20"/>
+        <w:ind w:left="360"/>
+      </w:pPr>
+      <w:r>
+        <w:rPr>
+          <w:rFonts w:ascii="Consolas" w:cs="Consolas" w:eastAsia="Consolas" w:hAnsi="Consolas"/>
+          <w:color w:val="3B82F6"/>
+          <w:sz w:val="18"/>
+          <w:szCs w:val="18"/>
+        </w:rPr>
+        <w:t xml:space="preserve">dividendWithholdingTaxRate, isEGXListed, useEgyptianRates, countryPreset,</w:t>
+      </w:r>
+    </w:p>
+    <w:p>
+      <w:pPr>
+        <w:shd w:fill="F8F9FA" w:color="F8F9FA" w:val="solid"/>
+        <w:spacing w:after="20"/>
+        <w:ind w:left="360"/>
+      </w:pPr>
+      <w:r>
+        <w:rPr>
+          <w:rFonts w:ascii="Consolas" w:cs="Consolas" w:eastAsia="Consolas" w:hAnsi="Consolas"/>
+          <w:color w:val="3B82F6"/>
+          <w:sz w:val="18"/>
+          <w:szCs w:val="18"/>
+        </w:rPr>
+        <w:t xml:space="preserve">fiscalYearPreset, fiscalYearEnd, projectionYears, historicalYears,</w:t>
+      </w:r>
+    </w:p>
+    <w:p>
+      <w:pPr>
+        <w:shd w:fill="F8F9FA" w:color="F8F9FA" w:val="solid"/>
+        <w:spacing w:after="20"/>
+        <w:ind w:left="360"/>
+      </w:pPr>
+      <w:r>
+        <w:rPr>
+          <w:rFonts w:ascii="Consolas" w:cs="Consolas" w:eastAsia="Consolas" w:hAnsi="Consolas"/>
+          <w:color w:val="3B82F6"/>
+          <w:sz w:val="18"/>
+          <w:szCs w:val="18"/>
+        </w:rPr>
+        <w:t xml:space="preserve">cbeRate, riskFreeRate, legacyDebtRate, employeeProfitSharingRate,</w:t>
+      </w:r>
+    </w:p>
+    <w:p>
+      <w:pPr>
+        <w:shd w:fill="F8F9FA" w:color="F8F9FA" w:val="solid"/>
+        <w:spacing w:after="20"/>
+        <w:ind w:left="360"/>
+      </w:pPr>
+      <w:r>
+        <w:rPr>
+          <w:rFonts w:ascii="Consolas" w:cs="Consolas" w:eastAsia="Consolas" w:hAnsi="Consolas"/>
+          <w:color w:val="3B82F6"/>
+          <w:sz w:val="18"/>
+          <w:szCs w:val="18"/>
+        </w:rPr>
+        <w:t xml:space="preserve">enableEmployeeProfitShare, enableTaxLossCarryforward, taxLossCarryforwardYears,</w:t>
+      </w:r>
+    </w:p>
+    <w:p>
+      <w:pPr>
+        <w:shd w:fill="F8F9FA" w:color="F8F9FA" w:val="solid"/>
+        <w:spacing w:after="20"/>
+        <w:ind w:left="360"/>
+      </w:pPr>
+      <w:r>
+        <w:rPr>
+          <w:rFonts w:ascii="Consolas" w:cs="Consolas" w:eastAsia="Consolas" w:hAnsi="Consolas"/>
+          <w:color w:val="3B82F6"/>
+          <w:sz w:val="18"/>
+          <w:szCs w:val="18"/>
+        </w:rPr>
+        <w:t xml:space="preserve">enableLegalReserve, legalReservePercent, paidUpCapital, legalReserveCap,</w:t>
+      </w:r>
+    </w:p>
+    <w:p>
+      <w:pPr>
+        <w:shd w:fill="F8F9FA" w:color="F8F9FA" w:val="solid"/>
+        <w:spacing w:after="20"/>
+        <w:ind w:left="360"/>
+      </w:pPr>
+      <w:r>
+        <w:rPr>
+          <w:rFonts w:ascii="Consolas" w:cs="Consolas" w:eastAsia="Consolas" w:hAnsi="Consolas"/>
+          <w:color w:val="3B82F6"/>
+          <w:sz w:val="18"/>
+          <w:szCs w:val="18"/>
+        </w:rPr>
+        <w:t xml:space="preserve">depreciationMethod, enableEndOfServiceBenefit,</w:t>
+      </w:r>
+    </w:p>
+    <w:p>
+      <w:pPr>
+        <w:shd w:fill="F8F9FA" w:color="F8F9FA" w:val="solid"/>
+        <w:spacing w:after="20"/>
+        <w:ind w:left="360"/>
+      </w:pPr>
+      <w:r>
+        <w:rPr>
+          <w:rFonts w:ascii="Consolas" w:cs="Consolas" w:eastAsia="Consolas" w:hAnsi="Consolas"/>
+          <w:color w:val="3B82F6"/>
+          <w:sz w:val="18"/>
+          <w:szCs w:val="18"/>
+        </w:rPr>
+        <w:t xml:space="preserve">interestRateOnDebt, interestRateOnCash</w:t>
+      </w:r>
+    </w:p>
+    <w:p>
+      <w:pPr>
+        <w:pStyle w:val="Heading2"/>
+        <w:spacing w:before="280" w:after="80"/>
+      </w:pPr>
+      <w:r>
+        <w:rPr>
+          <w:rFonts w:ascii="Calibri" w:cs="Calibri" w:eastAsia="Calibri" w:hAnsi="Calibri"/>
+          <w:b/>
+          <w:bCs/>
+          <w:color w:val="1E3A8A"/>
+          <w:sz w:val="26"/>
+          <w:szCs w:val="26"/>
+        </w:rPr>
+        <w:t xml:space="preserve">7.2 Persistence &amp; Migration (v4)</w:t>
+      </w:r>
+    </w:p>
+    <w:p>
+      <w:pPr>
+        <w:spacing w:after="80"/>
+        <w:jc w:val="left"/>
+      </w:pPr>
+      <w:r>
+        <w:rPr>
+          <w:rFonts w:ascii="Calibri" w:cs="Calibri" w:eastAsia="Calibri" w:hAnsi="Calibri"/>
+          <w:b w:val="false"/>
+          <w:bCs w:val="false"/>
+          <w:i w:val="false"/>
+          <w:iCs w:val="false"/>
+          <w:color w:val="1F2937"/>
+          <w:sz w:val="20"/>
+          <w:szCs w:val="20"/>
+        </w:rPr>
+        <w:t xml:space="preserve">Persisted fields (via partialize): companyName, ticker, industry, currency, country, fiscalYearEnd, valuationDate, historicalData, historicalInputs, scenarios, activeScenarioId, isDarkMode.</w:t>
+      </w:r>
+    </w:p>
+    <w:p>
+      <w:pPr>
+        <w:spacing w:after="80"/>
+        <w:jc w:val="left"/>
+      </w:pPr>
+      <w:r>
+        <w:rPr>
+          <w:rFonts w:ascii="Calibri" w:cs="Calibri" w:eastAsia="Calibri" w:hAnsi="Calibri"/>
+          <w:b w:val="false"/>
+          <w:bCs w:val="false"/>
+          <w:i w:val="false"/>
+          <w:iCs w:val="false"/>
+          <w:color w:val="1F2937"/>
+          <w:sz w:val="20"/>
+          <w:szCs w:val="20"/>
+        </w:rPr>
+        <w:t xml:space="preserve">v4 migration handles: scalar→array interest rate conversion, CBE rate defaults, tax regime sync (forces correct rate per regime), interest rate floor resets (US→Egypt), startYear 2025→2026, historical years 2023/2024→2024/2025.</w:t>
+      </w:r>
+    </w:p>
     <w:p>
       <w:r>
         <w:br w:type="page"/>
@@ -15569,6 +16732,1612 @@
           <w:szCs w:val="20"/>
         </w:rPr>
         <w:t xml:space="preserve">Fiscal year presets: Calendar (January-December), Egyptian Government (July-June), Custom.</w:t>
+      </w:r>
+    </w:p>
+    <w:p>
+      <w:pPr>
+        <w:pStyle w:val="Heading2"/>
+        <w:spacing w:before="280" w:after="80"/>
+      </w:pPr>
+      <w:r>
+        <w:rPr>
+          <w:rFonts w:ascii="Calibri" w:cs="Calibri" w:eastAsia="Calibri" w:hAnsi="Calibri"/>
+          <w:b/>
+          <w:bCs/>
+          <w:color w:val="1E3A8A"/>
+          <w:sz w:val="26"/>
+          <w:szCs w:val="26"/>
+        </w:rPr>
+        <w:t xml:space="preserve">9.3 Egyptian Industry Templates (templates/egyptian-industries.ts)</w:t>
+      </w:r>
+    </w:p>
+    <w:p>
+      <w:pPr>
+        <w:spacing w:after="80"/>
+        <w:jc w:val="left"/>
+      </w:pPr>
+      <w:r>
+        <w:rPr>
+          <w:rFonts w:ascii="Calibri" w:cs="Calibri" w:eastAsia="Calibri" w:hAnsi="Calibri"/>
+          <w:b w:val="false"/>
+          <w:bCs w:val="false"/>
+          <w:i w:val="false"/>
+          <w:iCs w:val="false"/>
+          <w:color w:val="1F2937"/>
+          <w:sz w:val="20"/>
+          <w:szCs w:val="20"/>
+        </w:rPr>
+        <w:t xml:space="preserve">5 pre-configured sector templates with bilingual names and typical assumption profiles:</w:t>
+      </w:r>
+    </w:p>
+    <w:tbl>
+      <w:tblPr>
+        <w:tblW w:type="pct" w:w="100%"/>
+        <w:tblBorders>
+          <w:top w:val="single" w:color="auto" w:sz="4"/>
+          <w:left w:val="single" w:color="auto" w:sz="4"/>
+          <w:bottom w:val="single" w:color="auto" w:sz="4"/>
+          <w:right w:val="single" w:color="auto" w:sz="4"/>
+          <w:insideH w:val="single" w:color="auto" w:sz="4"/>
+          <w:insideV w:val="single" w:color="auto" w:sz="4"/>
+        </w:tblBorders>
+      </w:tblPr>
+      <w:tblGrid>
+        <w:gridCol w:w="100"/>
+        <w:gridCol w:w="100"/>
+        <w:gridCol w:w="100"/>
+        <w:gridCol w:w="100"/>
+        <w:gridCol w:w="100"/>
+        <w:gridCol w:w="100"/>
+        <w:gridCol w:w="100"/>
+        <w:gridCol w:w="100"/>
+        <w:gridCol w:w="100"/>
+      </w:tblGrid>
+      <w:tr>
+        <w:trPr>
+          <w:tblHeader/>
+        </w:trPr>
+        <w:tc>
+          <w:tcPr>
+            <w:tcW w:type="pct" w:w="18%"/>
+            <w:shd w:fill="1E3A8A" w:color="1E3A8A" w:val="solid"/>
+            <w:tcMar>
+              <w:top w:type="dxa" w:w="40"/>
+              <w:left w:type="dxa" w:w="80"/>
+              <w:bottom w:type="dxa" w:w="40"/>
+              <w:right w:type="dxa" w:w="80"/>
+            </w:tcMar>
+          </w:tcPr>
+          <w:p>
+            <w:pPr>
+              <w:spacing w:after="0"/>
+            </w:pPr>
+            <w:r>
+              <w:rPr>
+                <w:rFonts w:ascii="Calibri" w:cs="Calibri" w:eastAsia="Calibri" w:hAnsi="Calibri"/>
+                <w:b/>
+                <w:bCs/>
+                <w:color w:val="FFFFFF"/>
+                <w:sz w:val="18"/>
+                <w:szCs w:val="18"/>
+              </w:rPr>
+              <w:t xml:space="preserve">Sector</w:t>
+            </w:r>
+          </w:p>
+        </w:tc>
+        <w:tc>
+          <w:tcPr>
+            <w:tcW w:type="pct" w:w="14%"/>
+            <w:shd w:fill="1E3A8A" w:color="1E3A8A" w:val="solid"/>
+            <w:tcMar>
+              <w:top w:type="dxa" w:w="40"/>
+              <w:left w:type="dxa" w:w="80"/>
+              <w:bottom w:type="dxa" w:w="40"/>
+              <w:right w:type="dxa" w:w="80"/>
+            </w:tcMar>
+          </w:tcPr>
+          <w:p>
+            <w:pPr>
+              <w:spacing w:after="0"/>
+            </w:pPr>
+            <w:r>
+              <w:rPr>
+                <w:rFonts w:ascii="Calibri" w:cs="Calibri" w:eastAsia="Calibri" w:hAnsi="Calibri"/>
+                <w:b/>
+                <w:bCs/>
+                <w:color w:val="FFFFFF"/>
+                <w:sz w:val="18"/>
+                <w:szCs w:val="18"/>
+              </w:rPr>
+              <w:t xml:space="preserve">Arabic</w:t>
+            </w:r>
+          </w:p>
+        </w:tc>
+        <w:tc>
+          <w:tcPr>
+            <w:tcW w:type="pct" w:w="7%"/>
+            <w:shd w:fill="1E3A8A" w:color="1E3A8A" w:val="solid"/>
+            <w:tcMar>
+              <w:top w:type="dxa" w:w="40"/>
+              <w:left w:type="dxa" w:w="80"/>
+              <w:bottom w:type="dxa" w:w="40"/>
+              <w:right w:type="dxa" w:w="80"/>
+            </w:tcMar>
+          </w:tcPr>
+          <w:p>
+            <w:pPr>
+              <w:spacing w:after="0"/>
+            </w:pPr>
+            <w:r>
+              <w:rPr>
+                <w:rFonts w:ascii="Calibri" w:cs="Calibri" w:eastAsia="Calibri" w:hAnsi="Calibri"/>
+                <w:b/>
+                <w:bCs/>
+                <w:color w:val="FFFFFF"/>
+                <w:sz w:val="18"/>
+                <w:szCs w:val="18"/>
+              </w:rPr>
+              <w:t xml:space="preserve">Growth</w:t>
+            </w:r>
+          </w:p>
+        </w:tc>
+        <w:tc>
+          <w:tcPr>
+            <w:tcW w:type="pct" w:w="6%"/>
+            <w:shd w:fill="1E3A8A" w:color="1E3A8A" w:val="solid"/>
+            <w:tcMar>
+              <w:top w:type="dxa" w:w="40"/>
+              <w:left w:type="dxa" w:w="80"/>
+              <w:bottom w:type="dxa" w:w="40"/>
+              <w:right w:type="dxa" w:w="80"/>
+            </w:tcMar>
+          </w:tcPr>
+          <w:p>
+            <w:pPr>
+              <w:spacing w:after="0"/>
+            </w:pPr>
+            <w:r>
+              <w:rPr>
+                <w:rFonts w:ascii="Calibri" w:cs="Calibri" w:eastAsia="Calibri" w:hAnsi="Calibri"/>
+                <w:b/>
+                <w:bCs/>
+                <w:color w:val="FFFFFF"/>
+                <w:sz w:val="18"/>
+                <w:szCs w:val="18"/>
+              </w:rPr>
+              <w:t xml:space="preserve">GM</w:t>
+            </w:r>
+          </w:p>
+        </w:tc>
+        <w:tc>
+          <w:tcPr>
+            <w:tcW w:type="pct" w:w="7%"/>
+            <w:shd w:fill="1E3A8A" w:color="1E3A8A" w:val="solid"/>
+            <w:tcMar>
+              <w:top w:type="dxa" w:w="40"/>
+              <w:left w:type="dxa" w:w="80"/>
+              <w:bottom w:type="dxa" w:w="40"/>
+              <w:right w:type="dxa" w:w="80"/>
+            </w:tcMar>
+          </w:tcPr>
+          <w:p>
+            <w:pPr>
+              <w:spacing w:after="0"/>
+            </w:pPr>
+            <w:r>
+              <w:rPr>
+                <w:rFonts w:ascii="Calibri" w:cs="Calibri" w:eastAsia="Calibri" w:hAnsi="Calibri"/>
+                <w:b/>
+                <w:bCs/>
+                <w:color w:val="FFFFFF"/>
+                <w:sz w:val="18"/>
+                <w:szCs w:val="18"/>
+              </w:rPr>
+              <w:t xml:space="preserve">SG&amp;A</w:t>
+            </w:r>
+          </w:p>
+        </w:tc>
+        <w:tc>
+          <w:tcPr>
+            <w:tcW w:type="pct" w:w="7%"/>
+            <w:shd w:fill="1E3A8A" w:color="1E3A8A" w:val="solid"/>
+            <w:tcMar>
+              <w:top w:type="dxa" w:w="40"/>
+              <w:left w:type="dxa" w:w="80"/>
+              <w:bottom w:type="dxa" w:w="40"/>
+              <w:right w:type="dxa" w:w="80"/>
+            </w:tcMar>
+          </w:tcPr>
+          <w:p>
+            <w:pPr>
+              <w:spacing w:after="0"/>
+            </w:pPr>
+            <w:r>
+              <w:rPr>
+                <w:rFonts w:ascii="Calibri" w:cs="Calibri" w:eastAsia="Calibri" w:hAnsi="Calibri"/>
+                <w:b/>
+                <w:bCs/>
+                <w:color w:val="FFFFFF"/>
+                <w:sz w:val="18"/>
+                <w:szCs w:val="18"/>
+              </w:rPr>
+              <w:t xml:space="preserve">DSO</w:t>
+            </w:r>
+          </w:p>
+        </w:tc>
+        <w:tc>
+          <w:tcPr>
+            <w:tcW w:type="pct" w:w="7%"/>
+            <w:shd w:fill="1E3A8A" w:color="1E3A8A" w:val="solid"/>
+            <w:tcMar>
+              <w:top w:type="dxa" w:w="40"/>
+              <w:left w:type="dxa" w:w="80"/>
+              <w:bottom w:type="dxa" w:w="40"/>
+              <w:right w:type="dxa" w:w="80"/>
+            </w:tcMar>
+          </w:tcPr>
+          <w:p>
+            <w:pPr>
+              <w:spacing w:after="0"/>
+            </w:pPr>
+            <w:r>
+              <w:rPr>
+                <w:rFonts w:ascii="Calibri" w:cs="Calibri" w:eastAsia="Calibri" w:hAnsi="Calibri"/>
+                <w:b/>
+                <w:bCs/>
+                <w:color w:val="FFFFFF"/>
+                <w:sz w:val="18"/>
+                <w:szCs w:val="18"/>
+              </w:rPr>
+              <w:t xml:space="preserve">DIO</w:t>
+            </w:r>
+          </w:p>
+        </w:tc>
+        <w:tc>
+          <w:tcPr>
+            <w:tcW w:type="pct" w:w="7%"/>
+            <w:shd w:fill="1E3A8A" w:color="1E3A8A" w:val="solid"/>
+            <w:tcMar>
+              <w:top w:type="dxa" w:w="40"/>
+              <w:left w:type="dxa" w:w="80"/>
+              <w:bottom w:type="dxa" w:w="40"/>
+              <w:right w:type="dxa" w:w="80"/>
+            </w:tcMar>
+          </w:tcPr>
+          <w:p>
+            <w:pPr>
+              <w:spacing w:after="0"/>
+            </w:pPr>
+            <w:r>
+              <w:rPr>
+                <w:rFonts w:ascii="Calibri" w:cs="Calibri" w:eastAsia="Calibri" w:hAnsi="Calibri"/>
+                <w:b/>
+                <w:bCs/>
+                <w:color w:val="FFFFFF"/>
+                <w:sz w:val="18"/>
+                <w:szCs w:val="18"/>
+              </w:rPr>
+              <w:t xml:space="preserve">DPO</w:t>
+            </w:r>
+          </w:p>
+        </w:tc>
+        <w:tc>
+          <w:tcPr>
+            <w:tcW w:type="pct" w:w="7%"/>
+            <w:shd w:fill="1E3A8A" w:color="1E3A8A" w:val="solid"/>
+            <w:tcMar>
+              <w:top w:type="dxa" w:w="40"/>
+              <w:left w:type="dxa" w:w="80"/>
+              <w:bottom w:type="dxa" w:w="40"/>
+              <w:right w:type="dxa" w:w="80"/>
+            </w:tcMar>
+          </w:tcPr>
+          <w:p>
+            <w:pPr>
+              <w:spacing w:after="0"/>
+            </w:pPr>
+            <w:r>
+              <w:rPr>
+                <w:rFonts w:ascii="Calibri" w:cs="Calibri" w:eastAsia="Calibri" w:hAnsi="Calibri"/>
+                <w:b/>
+                <w:bCs/>
+                <w:color w:val="FFFFFF"/>
+                <w:sz w:val="18"/>
+                <w:szCs w:val="18"/>
+              </w:rPr>
+              <w:t xml:space="preserve">CapEx%</w:t>
+            </w:r>
+          </w:p>
+        </w:tc>
+      </w:tr>
+      <w:tr>
+        <w:tc>
+          <w:tcPr>
+            <w:tcW w:type="pct" w:w="18%"/>
+            <w:shd w:fill="F3F4F6" w:color="F3F4F6" w:val="solid"/>
+            <w:tcMar>
+              <w:top w:type="dxa" w:w="40"/>
+              <w:left w:type="dxa" w:w="80"/>
+              <w:bottom w:type="dxa" w:w="40"/>
+              <w:right w:type="dxa" w:w="80"/>
+            </w:tcMar>
+          </w:tcPr>
+          <w:p>
+            <w:pPr>
+              <w:spacing w:after="0"/>
+            </w:pPr>
+            <w:r>
+              <w:rPr>
+                <w:rFonts w:ascii="Calibri" w:cs="Calibri" w:eastAsia="Calibri" w:hAnsi="Calibri"/>
+                <w:b w:val="false"/>
+                <w:bCs w:val="false"/>
+                <w:color w:val="1F2937"/>
+                <w:sz w:val="18"/>
+                <w:szCs w:val="18"/>
+              </w:rPr>
+              <w:t xml:space="preserve">Real Estate &amp; Construction</w:t>
+            </w:r>
+          </w:p>
+        </w:tc>
+        <w:tc>
+          <w:tcPr>
+            <w:tcW w:type="pct" w:w="14%"/>
+            <w:shd w:fill="F3F4F6" w:color="F3F4F6" w:val="solid"/>
+            <w:tcMar>
+              <w:top w:type="dxa" w:w="40"/>
+              <w:left w:type="dxa" w:w="80"/>
+              <w:bottom w:type="dxa" w:w="40"/>
+              <w:right w:type="dxa" w:w="80"/>
+            </w:tcMar>
+          </w:tcPr>
+          <w:p>
+            <w:pPr>
+              <w:spacing w:after="0"/>
+            </w:pPr>
+            <w:r>
+              <w:rPr>
+                <w:rFonts w:ascii="Calibri" w:cs="Calibri" w:eastAsia="Calibri" w:hAnsi="Calibri"/>
+                <w:b w:val="false"/>
+                <w:bCs w:val="false"/>
+                <w:color w:val="1F2937"/>
+                <w:sz w:val="18"/>
+                <w:szCs w:val="18"/>
+              </w:rPr>
+              <w:t xml:space="preserve">العقارات والبناء</w:t>
+            </w:r>
+          </w:p>
+        </w:tc>
+        <w:tc>
+          <w:tcPr>
+            <w:tcW w:type="pct" w:w="7%"/>
+            <w:shd w:fill="F3F4F6" w:color="F3F4F6" w:val="solid"/>
+            <w:tcMar>
+              <w:top w:type="dxa" w:w="40"/>
+              <w:left w:type="dxa" w:w="80"/>
+              <w:bottom w:type="dxa" w:w="40"/>
+              <w:right w:type="dxa" w:w="80"/>
+            </w:tcMar>
+          </w:tcPr>
+          <w:p>
+            <w:pPr>
+              <w:spacing w:after="0"/>
+            </w:pPr>
+            <w:r>
+              <w:rPr>
+                <w:rFonts w:ascii="Calibri" w:cs="Calibri" w:eastAsia="Calibri" w:hAnsi="Calibri"/>
+                <w:b w:val="false"/>
+                <w:bCs w:val="false"/>
+                <w:color w:val="1F2937"/>
+                <w:sz w:val="18"/>
+                <w:szCs w:val="18"/>
+              </w:rPr>
+              <w:t xml:space="preserve">15%</w:t>
+            </w:r>
+          </w:p>
+        </w:tc>
+        <w:tc>
+          <w:tcPr>
+            <w:tcW w:type="pct" w:w="6%"/>
+            <w:shd w:fill="F3F4F6" w:color="F3F4F6" w:val="solid"/>
+            <w:tcMar>
+              <w:top w:type="dxa" w:w="40"/>
+              <w:left w:type="dxa" w:w="80"/>
+              <w:bottom w:type="dxa" w:w="40"/>
+              <w:right w:type="dxa" w:w="80"/>
+            </w:tcMar>
+          </w:tcPr>
+          <w:p>
+            <w:pPr>
+              <w:spacing w:after="0"/>
+            </w:pPr>
+            <w:r>
+              <w:rPr>
+                <w:rFonts w:ascii="Calibri" w:cs="Calibri" w:eastAsia="Calibri" w:hAnsi="Calibri"/>
+                <w:b w:val="false"/>
+                <w:bCs w:val="false"/>
+                <w:color w:val="1F2937"/>
+                <w:sz w:val="18"/>
+                <w:szCs w:val="18"/>
+              </w:rPr>
+              <w:t xml:space="preserve">35%</w:t>
+            </w:r>
+          </w:p>
+        </w:tc>
+        <w:tc>
+          <w:tcPr>
+            <w:tcW w:type="pct" w:w="7%"/>
+            <w:shd w:fill="F3F4F6" w:color="F3F4F6" w:val="solid"/>
+            <w:tcMar>
+              <w:top w:type="dxa" w:w="40"/>
+              <w:left w:type="dxa" w:w="80"/>
+              <w:bottom w:type="dxa" w:w="40"/>
+              <w:right w:type="dxa" w:w="80"/>
+            </w:tcMar>
+          </w:tcPr>
+          <w:p>
+            <w:pPr>
+              <w:spacing w:after="0"/>
+            </w:pPr>
+            <w:r>
+              <w:rPr>
+                <w:rFonts w:ascii="Calibri" w:cs="Calibri" w:eastAsia="Calibri" w:hAnsi="Calibri"/>
+                <w:b w:val="false"/>
+                <w:bCs w:val="false"/>
+                <w:color w:val="1F2937"/>
+                <w:sz w:val="18"/>
+                <w:szCs w:val="18"/>
+              </w:rPr>
+              <w:t xml:space="preserve">8%</w:t>
+            </w:r>
+          </w:p>
+        </w:tc>
+        <w:tc>
+          <w:tcPr>
+            <w:tcW w:type="pct" w:w="7%"/>
+            <w:shd w:fill="F3F4F6" w:color="F3F4F6" w:val="solid"/>
+            <w:tcMar>
+              <w:top w:type="dxa" w:w="40"/>
+              <w:left w:type="dxa" w:w="80"/>
+              <w:bottom w:type="dxa" w:w="40"/>
+              <w:right w:type="dxa" w:w="80"/>
+            </w:tcMar>
+          </w:tcPr>
+          <w:p>
+            <w:pPr>
+              <w:spacing w:after="0"/>
+            </w:pPr>
+            <w:r>
+              <w:rPr>
+                <w:rFonts w:ascii="Calibri" w:cs="Calibri" w:eastAsia="Calibri" w:hAnsi="Calibri"/>
+                <w:b w:val="false"/>
+                <w:bCs w:val="false"/>
+                <w:color w:val="1F2937"/>
+                <w:sz w:val="18"/>
+                <w:szCs w:val="18"/>
+              </w:rPr>
+              <w:t xml:space="preserve">90</w:t>
+            </w:r>
+          </w:p>
+        </w:tc>
+        <w:tc>
+          <w:tcPr>
+            <w:tcW w:type="pct" w:w="7%"/>
+            <w:shd w:fill="F3F4F6" w:color="F3F4F6" w:val="solid"/>
+            <w:tcMar>
+              <w:top w:type="dxa" w:w="40"/>
+              <w:left w:type="dxa" w:w="80"/>
+              <w:bottom w:type="dxa" w:w="40"/>
+              <w:right w:type="dxa" w:w="80"/>
+            </w:tcMar>
+          </w:tcPr>
+          <w:p>
+            <w:pPr>
+              <w:spacing w:after="0"/>
+            </w:pPr>
+            <w:r>
+              <w:rPr>
+                <w:rFonts w:ascii="Calibri" w:cs="Calibri" w:eastAsia="Calibri" w:hAnsi="Calibri"/>
+                <w:b w:val="false"/>
+                <w:bCs w:val="false"/>
+                <w:color w:val="1F2937"/>
+                <w:sz w:val="18"/>
+                <w:szCs w:val="18"/>
+              </w:rPr>
+              <w:t xml:space="preserve">60</w:t>
+            </w:r>
+          </w:p>
+        </w:tc>
+        <w:tc>
+          <w:tcPr>
+            <w:tcW w:type="pct" w:w="7%"/>
+            <w:shd w:fill="F3F4F6" w:color="F3F4F6" w:val="solid"/>
+            <w:tcMar>
+              <w:top w:type="dxa" w:w="40"/>
+              <w:left w:type="dxa" w:w="80"/>
+              <w:bottom w:type="dxa" w:w="40"/>
+              <w:right w:type="dxa" w:w="80"/>
+            </w:tcMar>
+          </w:tcPr>
+          <w:p>
+            <w:pPr>
+              <w:spacing w:after="0"/>
+            </w:pPr>
+            <w:r>
+              <w:rPr>
+                <w:rFonts w:ascii="Calibri" w:cs="Calibri" w:eastAsia="Calibri" w:hAnsi="Calibri"/>
+                <w:b w:val="false"/>
+                <w:bCs w:val="false"/>
+                <w:color w:val="1F2937"/>
+                <w:sz w:val="18"/>
+                <w:szCs w:val="18"/>
+              </w:rPr>
+              <w:t xml:space="preserve">75</w:t>
+            </w:r>
+          </w:p>
+        </w:tc>
+        <w:tc>
+          <w:tcPr>
+            <w:tcW w:type="pct" w:w="7%"/>
+            <w:shd w:fill="F3F4F6" w:color="F3F4F6" w:val="solid"/>
+            <w:tcMar>
+              <w:top w:type="dxa" w:w="40"/>
+              <w:left w:type="dxa" w:w="80"/>
+              <w:bottom w:type="dxa" w:w="40"/>
+              <w:right w:type="dxa" w:w="80"/>
+            </w:tcMar>
+          </w:tcPr>
+          <w:p>
+            <w:pPr>
+              <w:spacing w:after="0"/>
+            </w:pPr>
+            <w:r>
+              <w:rPr>
+                <w:rFonts w:ascii="Calibri" w:cs="Calibri" w:eastAsia="Calibri" w:hAnsi="Calibri"/>
+                <w:b w:val="false"/>
+                <w:bCs w:val="false"/>
+                <w:color w:val="1F2937"/>
+                <w:sz w:val="18"/>
+                <w:szCs w:val="18"/>
+              </w:rPr>
+              <w:t xml:space="preserve">3%</w:t>
+            </w:r>
+          </w:p>
+        </w:tc>
+      </w:tr>
+      <w:tr>
+        <w:tc>
+          <w:tcPr>
+            <w:tcW w:type="pct" w:w="18%"/>
+            <w:shd w:fill="FFFFFF" w:color="FFFFFF" w:val="solid"/>
+            <w:tcMar>
+              <w:top w:type="dxa" w:w="40"/>
+              <w:left w:type="dxa" w:w="80"/>
+              <w:bottom w:type="dxa" w:w="40"/>
+              <w:right w:type="dxa" w:w="80"/>
+            </w:tcMar>
+          </w:tcPr>
+          <w:p>
+            <w:pPr>
+              <w:spacing w:after="0"/>
+            </w:pPr>
+            <w:r>
+              <w:rPr>
+                <w:rFonts w:ascii="Calibri" w:cs="Calibri" w:eastAsia="Calibri" w:hAnsi="Calibri"/>
+                <w:b w:val="false"/>
+                <w:bCs w:val="false"/>
+                <w:color w:val="1F2937"/>
+                <w:sz w:val="18"/>
+                <w:szCs w:val="18"/>
+              </w:rPr>
+              <w:t xml:space="preserve">FMCG / Consumer Goods</w:t>
+            </w:r>
+          </w:p>
+        </w:tc>
+        <w:tc>
+          <w:tcPr>
+            <w:tcW w:type="pct" w:w="14%"/>
+            <w:shd w:fill="FFFFFF" w:color="FFFFFF" w:val="solid"/>
+            <w:tcMar>
+              <w:top w:type="dxa" w:w="40"/>
+              <w:left w:type="dxa" w:w="80"/>
+              <w:bottom w:type="dxa" w:w="40"/>
+              <w:right w:type="dxa" w:w="80"/>
+            </w:tcMar>
+          </w:tcPr>
+          <w:p>
+            <w:pPr>
+              <w:spacing w:after="0"/>
+            </w:pPr>
+            <w:r>
+              <w:rPr>
+                <w:rFonts w:ascii="Calibri" w:cs="Calibri" w:eastAsia="Calibri" w:hAnsi="Calibri"/>
+                <w:b w:val="false"/>
+                <w:bCs w:val="false"/>
+                <w:color w:val="1F2937"/>
+                <w:sz w:val="18"/>
+                <w:szCs w:val="18"/>
+              </w:rPr>
+              <w:t xml:space="preserve">سلع استهلاكية</w:t>
+            </w:r>
+          </w:p>
+        </w:tc>
+        <w:tc>
+          <w:tcPr>
+            <w:tcW w:type="pct" w:w="7%"/>
+            <w:shd w:fill="FFFFFF" w:color="FFFFFF" w:val="solid"/>
+            <w:tcMar>
+              <w:top w:type="dxa" w:w="40"/>
+              <w:left w:type="dxa" w:w="80"/>
+              <w:bottom w:type="dxa" w:w="40"/>
+              <w:right w:type="dxa" w:w="80"/>
+            </w:tcMar>
+          </w:tcPr>
+          <w:p>
+            <w:pPr>
+              <w:spacing w:after="0"/>
+            </w:pPr>
+            <w:r>
+              <w:rPr>
+                <w:rFonts w:ascii="Calibri" w:cs="Calibri" w:eastAsia="Calibri" w:hAnsi="Calibri"/>
+                <w:b w:val="false"/>
+                <w:bCs w:val="false"/>
+                <w:color w:val="1F2937"/>
+                <w:sz w:val="18"/>
+                <w:szCs w:val="18"/>
+              </w:rPr>
+              <w:t xml:space="preserve">12%</w:t>
+            </w:r>
+          </w:p>
+        </w:tc>
+        <w:tc>
+          <w:tcPr>
+            <w:tcW w:type="pct" w:w="6%"/>
+            <w:shd w:fill="FFFFFF" w:color="FFFFFF" w:val="solid"/>
+            <w:tcMar>
+              <w:top w:type="dxa" w:w="40"/>
+              <w:left w:type="dxa" w:w="80"/>
+              <w:bottom w:type="dxa" w:w="40"/>
+              <w:right w:type="dxa" w:w="80"/>
+            </w:tcMar>
+          </w:tcPr>
+          <w:p>
+            <w:pPr>
+              <w:spacing w:after="0"/>
+            </w:pPr>
+            <w:r>
+              <w:rPr>
+                <w:rFonts w:ascii="Calibri" w:cs="Calibri" w:eastAsia="Calibri" w:hAnsi="Calibri"/>
+                <w:b w:val="false"/>
+                <w:bCs w:val="false"/>
+                <w:color w:val="1F2937"/>
+                <w:sz w:val="18"/>
+                <w:szCs w:val="18"/>
+              </w:rPr>
+              <w:t xml:space="preserve">30%</w:t>
+            </w:r>
+          </w:p>
+        </w:tc>
+        <w:tc>
+          <w:tcPr>
+            <w:tcW w:type="pct" w:w="7%"/>
+            <w:shd w:fill="FFFFFF" w:color="FFFFFF" w:val="solid"/>
+            <w:tcMar>
+              <w:top w:type="dxa" w:w="40"/>
+              <w:left w:type="dxa" w:w="80"/>
+              <w:bottom w:type="dxa" w:w="40"/>
+              <w:right w:type="dxa" w:w="80"/>
+            </w:tcMar>
+          </w:tcPr>
+          <w:p>
+            <w:pPr>
+              <w:spacing w:after="0"/>
+            </w:pPr>
+            <w:r>
+              <w:rPr>
+                <w:rFonts w:ascii="Calibri" w:cs="Calibri" w:eastAsia="Calibri" w:hAnsi="Calibri"/>
+                <w:b w:val="false"/>
+                <w:bCs w:val="false"/>
+                <w:color w:val="1F2937"/>
+                <w:sz w:val="18"/>
+                <w:szCs w:val="18"/>
+              </w:rPr>
+              <w:t xml:space="preserve">12%</w:t>
+            </w:r>
+          </w:p>
+        </w:tc>
+        <w:tc>
+          <w:tcPr>
+            <w:tcW w:type="pct" w:w="7%"/>
+            <w:shd w:fill="FFFFFF" w:color="FFFFFF" w:val="solid"/>
+            <w:tcMar>
+              <w:top w:type="dxa" w:w="40"/>
+              <w:left w:type="dxa" w:w="80"/>
+              <w:bottom w:type="dxa" w:w="40"/>
+              <w:right w:type="dxa" w:w="80"/>
+            </w:tcMar>
+          </w:tcPr>
+          <w:p>
+            <w:pPr>
+              <w:spacing w:after="0"/>
+            </w:pPr>
+            <w:r>
+              <w:rPr>
+                <w:rFonts w:ascii="Calibri" w:cs="Calibri" w:eastAsia="Calibri" w:hAnsi="Calibri"/>
+                <w:b w:val="false"/>
+                <w:bCs w:val="false"/>
+                <w:color w:val="1F2937"/>
+                <w:sz w:val="18"/>
+                <w:szCs w:val="18"/>
+              </w:rPr>
+              <w:t xml:space="preserve">30</w:t>
+            </w:r>
+          </w:p>
+        </w:tc>
+        <w:tc>
+          <w:tcPr>
+            <w:tcW w:type="pct" w:w="7%"/>
+            <w:shd w:fill="FFFFFF" w:color="FFFFFF" w:val="solid"/>
+            <w:tcMar>
+              <w:top w:type="dxa" w:w="40"/>
+              <w:left w:type="dxa" w:w="80"/>
+              <w:bottom w:type="dxa" w:w="40"/>
+              <w:right w:type="dxa" w:w="80"/>
+            </w:tcMar>
+          </w:tcPr>
+          <w:p>
+            <w:pPr>
+              <w:spacing w:after="0"/>
+            </w:pPr>
+            <w:r>
+              <w:rPr>
+                <w:rFonts w:ascii="Calibri" w:cs="Calibri" w:eastAsia="Calibri" w:hAnsi="Calibri"/>
+                <w:b w:val="false"/>
+                <w:bCs w:val="false"/>
+                <w:color w:val="1F2937"/>
+                <w:sz w:val="18"/>
+                <w:szCs w:val="18"/>
+              </w:rPr>
+              <w:t xml:space="preserve">45</w:t>
+            </w:r>
+          </w:p>
+        </w:tc>
+        <w:tc>
+          <w:tcPr>
+            <w:tcW w:type="pct" w:w="7%"/>
+            <w:shd w:fill="FFFFFF" w:color="FFFFFF" w:val="solid"/>
+            <w:tcMar>
+              <w:top w:type="dxa" w:w="40"/>
+              <w:left w:type="dxa" w:w="80"/>
+              <w:bottom w:type="dxa" w:w="40"/>
+              <w:right w:type="dxa" w:w="80"/>
+            </w:tcMar>
+          </w:tcPr>
+          <w:p>
+            <w:pPr>
+              <w:spacing w:after="0"/>
+            </w:pPr>
+            <w:r>
+              <w:rPr>
+                <w:rFonts w:ascii="Calibri" w:cs="Calibri" w:eastAsia="Calibri" w:hAnsi="Calibri"/>
+                <w:b w:val="false"/>
+                <w:bCs w:val="false"/>
+                <w:color w:val="1F2937"/>
+                <w:sz w:val="18"/>
+                <w:szCs w:val="18"/>
+              </w:rPr>
+              <w:t xml:space="preserve">40</w:t>
+            </w:r>
+          </w:p>
+        </w:tc>
+        <w:tc>
+          <w:tcPr>
+            <w:tcW w:type="pct" w:w="7%"/>
+            <w:shd w:fill="FFFFFF" w:color="FFFFFF" w:val="solid"/>
+            <w:tcMar>
+              <w:top w:type="dxa" w:w="40"/>
+              <w:left w:type="dxa" w:w="80"/>
+              <w:bottom w:type="dxa" w:w="40"/>
+              <w:right w:type="dxa" w:w="80"/>
+            </w:tcMar>
+          </w:tcPr>
+          <w:p>
+            <w:pPr>
+              <w:spacing w:after="0"/>
+            </w:pPr>
+            <w:r>
+              <w:rPr>
+                <w:rFonts w:ascii="Calibri" w:cs="Calibri" w:eastAsia="Calibri" w:hAnsi="Calibri"/>
+                <w:b w:val="false"/>
+                <w:bCs w:val="false"/>
+                <w:color w:val="1F2937"/>
+                <w:sz w:val="18"/>
+                <w:szCs w:val="18"/>
+              </w:rPr>
+              <w:t xml:space="preserve">5%</w:t>
+            </w:r>
+          </w:p>
+        </w:tc>
+      </w:tr>
+      <w:tr>
+        <w:tc>
+          <w:tcPr>
+            <w:tcW w:type="pct" w:w="18%"/>
+            <w:shd w:fill="F3F4F6" w:color="F3F4F6" w:val="solid"/>
+            <w:tcMar>
+              <w:top w:type="dxa" w:w="40"/>
+              <w:left w:type="dxa" w:w="80"/>
+              <w:bottom w:type="dxa" w:w="40"/>
+              <w:right w:type="dxa" w:w="80"/>
+            </w:tcMar>
+          </w:tcPr>
+          <w:p>
+            <w:pPr>
+              <w:spacing w:after="0"/>
+            </w:pPr>
+            <w:r>
+              <w:rPr>
+                <w:rFonts w:ascii="Calibri" w:cs="Calibri" w:eastAsia="Calibri" w:hAnsi="Calibri"/>
+                <w:b w:val="false"/>
+                <w:bCs w:val="false"/>
+                <w:color w:val="1F2937"/>
+                <w:sz w:val="18"/>
+                <w:szCs w:val="18"/>
+              </w:rPr>
+              <w:t xml:space="preserve">Telecom &amp; Technology</w:t>
+            </w:r>
+          </w:p>
+        </w:tc>
+        <w:tc>
+          <w:tcPr>
+            <w:tcW w:type="pct" w:w="14%"/>
+            <w:shd w:fill="F3F4F6" w:color="F3F4F6" w:val="solid"/>
+            <w:tcMar>
+              <w:top w:type="dxa" w:w="40"/>
+              <w:left w:type="dxa" w:w="80"/>
+              <w:bottom w:type="dxa" w:w="40"/>
+              <w:right w:type="dxa" w:w="80"/>
+            </w:tcMar>
+          </w:tcPr>
+          <w:p>
+            <w:pPr>
+              <w:spacing w:after="0"/>
+            </w:pPr>
+            <w:r>
+              <w:rPr>
+                <w:rFonts w:ascii="Calibri" w:cs="Calibri" w:eastAsia="Calibri" w:hAnsi="Calibri"/>
+                <w:b w:val="false"/>
+                <w:bCs w:val="false"/>
+                <w:color w:val="1F2937"/>
+                <w:sz w:val="18"/>
+                <w:szCs w:val="18"/>
+              </w:rPr>
+              <w:t xml:space="preserve">اتصالات وتكنولوجيا</w:t>
+            </w:r>
+          </w:p>
+        </w:tc>
+        <w:tc>
+          <w:tcPr>
+            <w:tcW w:type="pct" w:w="7%"/>
+            <w:shd w:fill="F3F4F6" w:color="F3F4F6" w:val="solid"/>
+            <w:tcMar>
+              <w:top w:type="dxa" w:w="40"/>
+              <w:left w:type="dxa" w:w="80"/>
+              <w:bottom w:type="dxa" w:w="40"/>
+              <w:right w:type="dxa" w:w="80"/>
+            </w:tcMar>
+          </w:tcPr>
+          <w:p>
+            <w:pPr>
+              <w:spacing w:after="0"/>
+            </w:pPr>
+            <w:r>
+              <w:rPr>
+                <w:rFonts w:ascii="Calibri" w:cs="Calibri" w:eastAsia="Calibri" w:hAnsi="Calibri"/>
+                <w:b w:val="false"/>
+                <w:bCs w:val="false"/>
+                <w:color w:val="1F2937"/>
+                <w:sz w:val="18"/>
+                <w:szCs w:val="18"/>
+              </w:rPr>
+              <w:t xml:space="preserve">10%</w:t>
+            </w:r>
+          </w:p>
+        </w:tc>
+        <w:tc>
+          <w:tcPr>
+            <w:tcW w:type="pct" w:w="6%"/>
+            <w:shd w:fill="F3F4F6" w:color="F3F4F6" w:val="solid"/>
+            <w:tcMar>
+              <w:top w:type="dxa" w:w="40"/>
+              <w:left w:type="dxa" w:w="80"/>
+              <w:bottom w:type="dxa" w:w="40"/>
+              <w:right w:type="dxa" w:w="80"/>
+            </w:tcMar>
+          </w:tcPr>
+          <w:p>
+            <w:pPr>
+              <w:spacing w:after="0"/>
+            </w:pPr>
+            <w:r>
+              <w:rPr>
+                <w:rFonts w:ascii="Calibri" w:cs="Calibri" w:eastAsia="Calibri" w:hAnsi="Calibri"/>
+                <w:b w:val="false"/>
+                <w:bCs w:val="false"/>
+                <w:color w:val="1F2937"/>
+                <w:sz w:val="18"/>
+                <w:szCs w:val="18"/>
+              </w:rPr>
+              <w:t xml:space="preserve">55%</w:t>
+            </w:r>
+          </w:p>
+        </w:tc>
+        <w:tc>
+          <w:tcPr>
+            <w:tcW w:type="pct" w:w="7%"/>
+            <w:shd w:fill="F3F4F6" w:color="F3F4F6" w:val="solid"/>
+            <w:tcMar>
+              <w:top w:type="dxa" w:w="40"/>
+              <w:left w:type="dxa" w:w="80"/>
+              <w:bottom w:type="dxa" w:w="40"/>
+              <w:right w:type="dxa" w:w="80"/>
+            </w:tcMar>
+          </w:tcPr>
+          <w:p>
+            <w:pPr>
+              <w:spacing w:after="0"/>
+            </w:pPr>
+            <w:r>
+              <w:rPr>
+                <w:rFonts w:ascii="Calibri" w:cs="Calibri" w:eastAsia="Calibri" w:hAnsi="Calibri"/>
+                <w:b w:val="false"/>
+                <w:bCs w:val="false"/>
+                <w:color w:val="1F2937"/>
+                <w:sz w:val="18"/>
+                <w:szCs w:val="18"/>
+              </w:rPr>
+              <w:t xml:space="preserve">15%</w:t>
+            </w:r>
+          </w:p>
+        </w:tc>
+        <w:tc>
+          <w:tcPr>
+            <w:tcW w:type="pct" w:w="7%"/>
+            <w:shd w:fill="F3F4F6" w:color="F3F4F6" w:val="solid"/>
+            <w:tcMar>
+              <w:top w:type="dxa" w:w="40"/>
+              <w:left w:type="dxa" w:w="80"/>
+              <w:bottom w:type="dxa" w:w="40"/>
+              <w:right w:type="dxa" w:w="80"/>
+            </w:tcMar>
+          </w:tcPr>
+          <w:p>
+            <w:pPr>
+              <w:spacing w:after="0"/>
+            </w:pPr>
+            <w:r>
+              <w:rPr>
+                <w:rFonts w:ascii="Calibri" w:cs="Calibri" w:eastAsia="Calibri" w:hAnsi="Calibri"/>
+                <w:b w:val="false"/>
+                <w:bCs w:val="false"/>
+                <w:color w:val="1F2937"/>
+                <w:sz w:val="18"/>
+                <w:szCs w:val="18"/>
+              </w:rPr>
+              <w:t xml:space="preserve">35</w:t>
+            </w:r>
+          </w:p>
+        </w:tc>
+        <w:tc>
+          <w:tcPr>
+            <w:tcW w:type="pct" w:w="7%"/>
+            <w:shd w:fill="F3F4F6" w:color="F3F4F6" w:val="solid"/>
+            <w:tcMar>
+              <w:top w:type="dxa" w:w="40"/>
+              <w:left w:type="dxa" w:w="80"/>
+              <w:bottom w:type="dxa" w:w="40"/>
+              <w:right w:type="dxa" w:w="80"/>
+            </w:tcMar>
+          </w:tcPr>
+          <w:p>
+            <w:pPr>
+              <w:spacing w:after="0"/>
+            </w:pPr>
+            <w:r>
+              <w:rPr>
+                <w:rFonts w:ascii="Calibri" w:cs="Calibri" w:eastAsia="Calibri" w:hAnsi="Calibri"/>
+                <w:b w:val="false"/>
+                <w:bCs w:val="false"/>
+                <w:color w:val="1F2937"/>
+                <w:sz w:val="18"/>
+                <w:szCs w:val="18"/>
+              </w:rPr>
+              <w:t xml:space="preserve">5</w:t>
+            </w:r>
+          </w:p>
+        </w:tc>
+        <w:tc>
+          <w:tcPr>
+            <w:tcW w:type="pct" w:w="7%"/>
+            <w:shd w:fill="F3F4F6" w:color="F3F4F6" w:val="solid"/>
+            <w:tcMar>
+              <w:top w:type="dxa" w:w="40"/>
+              <w:left w:type="dxa" w:w="80"/>
+              <w:bottom w:type="dxa" w:w="40"/>
+              <w:right w:type="dxa" w:w="80"/>
+            </w:tcMar>
+          </w:tcPr>
+          <w:p>
+            <w:pPr>
+              <w:spacing w:after="0"/>
+            </w:pPr>
+            <w:r>
+              <w:rPr>
+                <w:rFonts w:ascii="Calibri" w:cs="Calibri" w:eastAsia="Calibri" w:hAnsi="Calibri"/>
+                <w:b w:val="false"/>
+                <w:bCs w:val="false"/>
+                <w:color w:val="1F2937"/>
+                <w:sz w:val="18"/>
+                <w:szCs w:val="18"/>
+              </w:rPr>
+              <w:t xml:space="preserve">50</w:t>
+            </w:r>
+          </w:p>
+        </w:tc>
+        <w:tc>
+          <w:tcPr>
+            <w:tcW w:type="pct" w:w="7%"/>
+            <w:shd w:fill="F3F4F6" w:color="F3F4F6" w:val="solid"/>
+            <w:tcMar>
+              <w:top w:type="dxa" w:w="40"/>
+              <w:left w:type="dxa" w:w="80"/>
+              <w:bottom w:type="dxa" w:w="40"/>
+              <w:right w:type="dxa" w:w="80"/>
+            </w:tcMar>
+          </w:tcPr>
+          <w:p>
+            <w:pPr>
+              <w:spacing w:after="0"/>
+            </w:pPr>
+            <w:r>
+              <w:rPr>
+                <w:rFonts w:ascii="Calibri" w:cs="Calibri" w:eastAsia="Calibri" w:hAnsi="Calibri"/>
+                <w:b w:val="false"/>
+                <w:bCs w:val="false"/>
+                <w:color w:val="1F2937"/>
+                <w:sz w:val="18"/>
+                <w:szCs w:val="18"/>
+              </w:rPr>
+              <w:t xml:space="preserve">15%</w:t>
+            </w:r>
+          </w:p>
+        </w:tc>
+      </w:tr>
+      <w:tr>
+        <w:tc>
+          <w:tcPr>
+            <w:tcW w:type="pct" w:w="18%"/>
+            <w:shd w:fill="FFFFFF" w:color="FFFFFF" w:val="solid"/>
+            <w:tcMar>
+              <w:top w:type="dxa" w:w="40"/>
+              <w:left w:type="dxa" w:w="80"/>
+              <w:bottom w:type="dxa" w:w="40"/>
+              <w:right w:type="dxa" w:w="80"/>
+            </w:tcMar>
+          </w:tcPr>
+          <w:p>
+            <w:pPr>
+              <w:spacing w:after="0"/>
+            </w:pPr>
+            <w:r>
+              <w:rPr>
+                <w:rFonts w:ascii="Calibri" w:cs="Calibri" w:eastAsia="Calibri" w:hAnsi="Calibri"/>
+                <w:b w:val="false"/>
+                <w:bCs w:val="false"/>
+                <w:color w:val="1F2937"/>
+                <w:sz w:val="18"/>
+                <w:szCs w:val="18"/>
+              </w:rPr>
+              <w:t xml:space="preserve">Petrochemicals &amp; Energy</w:t>
+            </w:r>
+          </w:p>
+        </w:tc>
+        <w:tc>
+          <w:tcPr>
+            <w:tcW w:type="pct" w:w="14%"/>
+            <w:shd w:fill="FFFFFF" w:color="FFFFFF" w:val="solid"/>
+            <w:tcMar>
+              <w:top w:type="dxa" w:w="40"/>
+              <w:left w:type="dxa" w:w="80"/>
+              <w:bottom w:type="dxa" w:w="40"/>
+              <w:right w:type="dxa" w:w="80"/>
+            </w:tcMar>
+          </w:tcPr>
+          <w:p>
+            <w:pPr>
+              <w:spacing w:after="0"/>
+            </w:pPr>
+            <w:r>
+              <w:rPr>
+                <w:rFonts w:ascii="Calibri" w:cs="Calibri" w:eastAsia="Calibri" w:hAnsi="Calibri"/>
+                <w:b w:val="false"/>
+                <w:bCs w:val="false"/>
+                <w:color w:val="1F2937"/>
+                <w:sz w:val="18"/>
+                <w:szCs w:val="18"/>
+              </w:rPr>
+              <w:t xml:space="preserve">بتروكيماويات وطاقة</w:t>
+            </w:r>
+          </w:p>
+        </w:tc>
+        <w:tc>
+          <w:tcPr>
+            <w:tcW w:type="pct" w:w="7%"/>
+            <w:shd w:fill="FFFFFF" w:color="FFFFFF" w:val="solid"/>
+            <w:tcMar>
+              <w:top w:type="dxa" w:w="40"/>
+              <w:left w:type="dxa" w:w="80"/>
+              <w:bottom w:type="dxa" w:w="40"/>
+              <w:right w:type="dxa" w:w="80"/>
+            </w:tcMar>
+          </w:tcPr>
+          <w:p>
+            <w:pPr>
+              <w:spacing w:after="0"/>
+            </w:pPr>
+            <w:r>
+              <w:rPr>
+                <w:rFonts w:ascii="Calibri" w:cs="Calibri" w:eastAsia="Calibri" w:hAnsi="Calibri"/>
+                <w:b w:val="false"/>
+                <w:bCs w:val="false"/>
+                <w:color w:val="1F2937"/>
+                <w:sz w:val="18"/>
+                <w:szCs w:val="18"/>
+              </w:rPr>
+              <w:t xml:space="preserve">8%</w:t>
+            </w:r>
+          </w:p>
+        </w:tc>
+        <w:tc>
+          <w:tcPr>
+            <w:tcW w:type="pct" w:w="6%"/>
+            <w:shd w:fill="FFFFFF" w:color="FFFFFF" w:val="solid"/>
+            <w:tcMar>
+              <w:top w:type="dxa" w:w="40"/>
+              <w:left w:type="dxa" w:w="80"/>
+              <w:bottom w:type="dxa" w:w="40"/>
+              <w:right w:type="dxa" w:w="80"/>
+            </w:tcMar>
+          </w:tcPr>
+          <w:p>
+            <w:pPr>
+              <w:spacing w:after="0"/>
+            </w:pPr>
+            <w:r>
+              <w:rPr>
+                <w:rFonts w:ascii="Calibri" w:cs="Calibri" w:eastAsia="Calibri" w:hAnsi="Calibri"/>
+                <w:b w:val="false"/>
+                <w:bCs w:val="false"/>
+                <w:color w:val="1F2937"/>
+                <w:sz w:val="18"/>
+                <w:szCs w:val="18"/>
+              </w:rPr>
+              <w:t xml:space="preserve">25%</w:t>
+            </w:r>
+          </w:p>
+        </w:tc>
+        <w:tc>
+          <w:tcPr>
+            <w:tcW w:type="pct" w:w="7%"/>
+            <w:shd w:fill="FFFFFF" w:color="FFFFFF" w:val="solid"/>
+            <w:tcMar>
+              <w:top w:type="dxa" w:w="40"/>
+              <w:left w:type="dxa" w:w="80"/>
+              <w:bottom w:type="dxa" w:w="40"/>
+              <w:right w:type="dxa" w:w="80"/>
+            </w:tcMar>
+          </w:tcPr>
+          <w:p>
+            <w:pPr>
+              <w:spacing w:after="0"/>
+            </w:pPr>
+            <w:r>
+              <w:rPr>
+                <w:rFonts w:ascii="Calibri" w:cs="Calibri" w:eastAsia="Calibri" w:hAnsi="Calibri"/>
+                <w:b w:val="false"/>
+                <w:bCs w:val="false"/>
+                <w:color w:val="1F2937"/>
+                <w:sz w:val="18"/>
+                <w:szCs w:val="18"/>
+              </w:rPr>
+              <w:t xml:space="preserve">6%</w:t>
+            </w:r>
+          </w:p>
+        </w:tc>
+        <w:tc>
+          <w:tcPr>
+            <w:tcW w:type="pct" w:w="7%"/>
+            <w:shd w:fill="FFFFFF" w:color="FFFFFF" w:val="solid"/>
+            <w:tcMar>
+              <w:top w:type="dxa" w:w="40"/>
+              <w:left w:type="dxa" w:w="80"/>
+              <w:bottom w:type="dxa" w:w="40"/>
+              <w:right w:type="dxa" w:w="80"/>
+            </w:tcMar>
+          </w:tcPr>
+          <w:p>
+            <w:pPr>
+              <w:spacing w:after="0"/>
+            </w:pPr>
+            <w:r>
+              <w:rPr>
+                <w:rFonts w:ascii="Calibri" w:cs="Calibri" w:eastAsia="Calibri" w:hAnsi="Calibri"/>
+                <w:b w:val="false"/>
+                <w:bCs w:val="false"/>
+                <w:color w:val="1F2937"/>
+                <w:sz w:val="18"/>
+                <w:szCs w:val="18"/>
+              </w:rPr>
+              <w:t xml:space="preserve">45</w:t>
+            </w:r>
+          </w:p>
+        </w:tc>
+        <w:tc>
+          <w:tcPr>
+            <w:tcW w:type="pct" w:w="7%"/>
+            <w:shd w:fill="FFFFFF" w:color="FFFFFF" w:val="solid"/>
+            <w:tcMar>
+              <w:top w:type="dxa" w:w="40"/>
+              <w:left w:type="dxa" w:w="80"/>
+              <w:bottom w:type="dxa" w:w="40"/>
+              <w:right w:type="dxa" w:w="80"/>
+            </w:tcMar>
+          </w:tcPr>
+          <w:p>
+            <w:pPr>
+              <w:spacing w:after="0"/>
+            </w:pPr>
+            <w:r>
+              <w:rPr>
+                <w:rFonts w:ascii="Calibri" w:cs="Calibri" w:eastAsia="Calibri" w:hAnsi="Calibri"/>
+                <w:b w:val="false"/>
+                <w:bCs w:val="false"/>
+                <w:color w:val="1F2937"/>
+                <w:sz w:val="18"/>
+                <w:szCs w:val="18"/>
+              </w:rPr>
+              <w:t xml:space="preserve">30</w:t>
+            </w:r>
+          </w:p>
+        </w:tc>
+        <w:tc>
+          <w:tcPr>
+            <w:tcW w:type="pct" w:w="7%"/>
+            <w:shd w:fill="FFFFFF" w:color="FFFFFF" w:val="solid"/>
+            <w:tcMar>
+              <w:top w:type="dxa" w:w="40"/>
+              <w:left w:type="dxa" w:w="80"/>
+              <w:bottom w:type="dxa" w:w="40"/>
+              <w:right w:type="dxa" w:w="80"/>
+            </w:tcMar>
+          </w:tcPr>
+          <w:p>
+            <w:pPr>
+              <w:spacing w:after="0"/>
+            </w:pPr>
+            <w:r>
+              <w:rPr>
+                <w:rFonts w:ascii="Calibri" w:cs="Calibri" w:eastAsia="Calibri" w:hAnsi="Calibri"/>
+                <w:b w:val="false"/>
+                <w:bCs w:val="false"/>
+                <w:color w:val="1F2937"/>
+                <w:sz w:val="18"/>
+                <w:szCs w:val="18"/>
+              </w:rPr>
+              <w:t xml:space="preserve">45</w:t>
+            </w:r>
+          </w:p>
+        </w:tc>
+        <w:tc>
+          <w:tcPr>
+            <w:tcW w:type="pct" w:w="7%"/>
+            <w:shd w:fill="FFFFFF" w:color="FFFFFF" w:val="solid"/>
+            <w:tcMar>
+              <w:top w:type="dxa" w:w="40"/>
+              <w:left w:type="dxa" w:w="80"/>
+              <w:bottom w:type="dxa" w:w="40"/>
+              <w:right w:type="dxa" w:w="80"/>
+            </w:tcMar>
+          </w:tcPr>
+          <w:p>
+            <w:pPr>
+              <w:spacing w:after="0"/>
+            </w:pPr>
+            <w:r>
+              <w:rPr>
+                <w:rFonts w:ascii="Calibri" w:cs="Calibri" w:eastAsia="Calibri" w:hAnsi="Calibri"/>
+                <w:b w:val="false"/>
+                <w:bCs w:val="false"/>
+                <w:color w:val="1F2937"/>
+                <w:sz w:val="18"/>
+                <w:szCs w:val="18"/>
+              </w:rPr>
+              <w:t xml:space="preserve">8%</w:t>
+            </w:r>
+          </w:p>
+        </w:tc>
+      </w:tr>
+      <w:tr>
+        <w:tc>
+          <w:tcPr>
+            <w:tcW w:type="pct" w:w="18%"/>
+            <w:shd w:fill="F3F4F6" w:color="F3F4F6" w:val="solid"/>
+            <w:tcMar>
+              <w:top w:type="dxa" w:w="40"/>
+              <w:left w:type="dxa" w:w="80"/>
+              <w:bottom w:type="dxa" w:w="40"/>
+              <w:right w:type="dxa" w:w="80"/>
+            </w:tcMar>
+          </w:tcPr>
+          <w:p>
+            <w:pPr>
+              <w:spacing w:after="0"/>
+            </w:pPr>
+            <w:r>
+              <w:rPr>
+                <w:rFonts w:ascii="Calibri" w:cs="Calibri" w:eastAsia="Calibri" w:hAnsi="Calibri"/>
+                <w:b w:val="false"/>
+                <w:bCs w:val="false"/>
+                <w:color w:val="1F2937"/>
+                <w:sz w:val="18"/>
+                <w:szCs w:val="18"/>
+              </w:rPr>
+              <w:t xml:space="preserve">Tourism &amp; Hospitality</w:t>
+            </w:r>
+          </w:p>
+        </w:tc>
+        <w:tc>
+          <w:tcPr>
+            <w:tcW w:type="pct" w:w="14%"/>
+            <w:shd w:fill="F3F4F6" w:color="F3F4F6" w:val="solid"/>
+            <w:tcMar>
+              <w:top w:type="dxa" w:w="40"/>
+              <w:left w:type="dxa" w:w="80"/>
+              <w:bottom w:type="dxa" w:w="40"/>
+              <w:right w:type="dxa" w:w="80"/>
+            </w:tcMar>
+          </w:tcPr>
+          <w:p>
+            <w:pPr>
+              <w:spacing w:after="0"/>
+            </w:pPr>
+            <w:r>
+              <w:rPr>
+                <w:rFonts w:ascii="Calibri" w:cs="Calibri" w:eastAsia="Calibri" w:hAnsi="Calibri"/>
+                <w:b w:val="false"/>
+                <w:bCs w:val="false"/>
+                <w:color w:val="1F2937"/>
+                <w:sz w:val="18"/>
+                <w:szCs w:val="18"/>
+              </w:rPr>
+              <w:t xml:space="preserve">سياحة وضيافة</w:t>
+            </w:r>
+          </w:p>
+        </w:tc>
+        <w:tc>
+          <w:tcPr>
+            <w:tcW w:type="pct" w:w="7%"/>
+            <w:shd w:fill="F3F4F6" w:color="F3F4F6" w:val="solid"/>
+            <w:tcMar>
+              <w:top w:type="dxa" w:w="40"/>
+              <w:left w:type="dxa" w:w="80"/>
+              <w:bottom w:type="dxa" w:w="40"/>
+              <w:right w:type="dxa" w:w="80"/>
+            </w:tcMar>
+          </w:tcPr>
+          <w:p>
+            <w:pPr>
+              <w:spacing w:after="0"/>
+            </w:pPr>
+            <w:r>
+              <w:rPr>
+                <w:rFonts w:ascii="Calibri" w:cs="Calibri" w:eastAsia="Calibri" w:hAnsi="Calibri"/>
+                <w:b w:val="false"/>
+                <w:bCs w:val="false"/>
+                <w:color w:val="1F2937"/>
+                <w:sz w:val="18"/>
+                <w:szCs w:val="18"/>
+              </w:rPr>
+              <w:t xml:space="preserve">18%</w:t>
+            </w:r>
+          </w:p>
+        </w:tc>
+        <w:tc>
+          <w:tcPr>
+            <w:tcW w:type="pct" w:w="6%"/>
+            <w:shd w:fill="F3F4F6" w:color="F3F4F6" w:val="solid"/>
+            <w:tcMar>
+              <w:top w:type="dxa" w:w="40"/>
+              <w:left w:type="dxa" w:w="80"/>
+              <w:bottom w:type="dxa" w:w="40"/>
+              <w:right w:type="dxa" w:w="80"/>
+            </w:tcMar>
+          </w:tcPr>
+          <w:p>
+            <w:pPr>
+              <w:spacing w:after="0"/>
+            </w:pPr>
+            <w:r>
+              <w:rPr>
+                <w:rFonts w:ascii="Calibri" w:cs="Calibri" w:eastAsia="Calibri" w:hAnsi="Calibri"/>
+                <w:b w:val="false"/>
+                <w:bCs w:val="false"/>
+                <w:color w:val="1F2937"/>
+                <w:sz w:val="18"/>
+                <w:szCs w:val="18"/>
+              </w:rPr>
+              <w:t xml:space="preserve">45%</w:t>
+            </w:r>
+          </w:p>
+        </w:tc>
+        <w:tc>
+          <w:tcPr>
+            <w:tcW w:type="pct" w:w="7%"/>
+            <w:shd w:fill="F3F4F6" w:color="F3F4F6" w:val="solid"/>
+            <w:tcMar>
+              <w:top w:type="dxa" w:w="40"/>
+              <w:left w:type="dxa" w:w="80"/>
+              <w:bottom w:type="dxa" w:w="40"/>
+              <w:right w:type="dxa" w:w="80"/>
+            </w:tcMar>
+          </w:tcPr>
+          <w:p>
+            <w:pPr>
+              <w:spacing w:after="0"/>
+            </w:pPr>
+            <w:r>
+              <w:rPr>
+                <w:rFonts w:ascii="Calibri" w:cs="Calibri" w:eastAsia="Calibri" w:hAnsi="Calibri"/>
+                <w:b w:val="false"/>
+                <w:bCs w:val="false"/>
+                <w:color w:val="1F2937"/>
+                <w:sz w:val="18"/>
+                <w:szCs w:val="18"/>
+              </w:rPr>
+              <w:t xml:space="preserve">20%</w:t>
+            </w:r>
+          </w:p>
+        </w:tc>
+        <w:tc>
+          <w:tcPr>
+            <w:tcW w:type="pct" w:w="7%"/>
+            <w:shd w:fill="F3F4F6" w:color="F3F4F6" w:val="solid"/>
+            <w:tcMar>
+              <w:top w:type="dxa" w:w="40"/>
+              <w:left w:type="dxa" w:w="80"/>
+              <w:bottom w:type="dxa" w:w="40"/>
+              <w:right w:type="dxa" w:w="80"/>
+            </w:tcMar>
+          </w:tcPr>
+          <w:p>
+            <w:pPr>
+              <w:spacing w:after="0"/>
+            </w:pPr>
+            <w:r>
+              <w:rPr>
+                <w:rFonts w:ascii="Calibri" w:cs="Calibri" w:eastAsia="Calibri" w:hAnsi="Calibri"/>
+                <w:b w:val="false"/>
+                <w:bCs w:val="false"/>
+                <w:color w:val="1F2937"/>
+                <w:sz w:val="18"/>
+                <w:szCs w:val="18"/>
+              </w:rPr>
+              <w:t xml:space="preserve">15</w:t>
+            </w:r>
+          </w:p>
+        </w:tc>
+        <w:tc>
+          <w:tcPr>
+            <w:tcW w:type="pct" w:w="7%"/>
+            <w:shd w:fill="F3F4F6" w:color="F3F4F6" w:val="solid"/>
+            <w:tcMar>
+              <w:top w:type="dxa" w:w="40"/>
+              <w:left w:type="dxa" w:w="80"/>
+              <w:bottom w:type="dxa" w:w="40"/>
+              <w:right w:type="dxa" w:w="80"/>
+            </w:tcMar>
+          </w:tcPr>
+          <w:p>
+            <w:pPr>
+              <w:spacing w:after="0"/>
+            </w:pPr>
+            <w:r>
+              <w:rPr>
+                <w:rFonts w:ascii="Calibri" w:cs="Calibri" w:eastAsia="Calibri" w:hAnsi="Calibri"/>
+                <w:b w:val="false"/>
+                <w:bCs w:val="false"/>
+                <w:color w:val="1F2937"/>
+                <w:sz w:val="18"/>
+                <w:szCs w:val="18"/>
+              </w:rPr>
+              <w:t xml:space="preserve">10</w:t>
+            </w:r>
+          </w:p>
+        </w:tc>
+        <w:tc>
+          <w:tcPr>
+            <w:tcW w:type="pct" w:w="7%"/>
+            <w:shd w:fill="F3F4F6" w:color="F3F4F6" w:val="solid"/>
+            <w:tcMar>
+              <w:top w:type="dxa" w:w="40"/>
+              <w:left w:type="dxa" w:w="80"/>
+              <w:bottom w:type="dxa" w:w="40"/>
+              <w:right w:type="dxa" w:w="80"/>
+            </w:tcMar>
+          </w:tcPr>
+          <w:p>
+            <w:pPr>
+              <w:spacing w:after="0"/>
+            </w:pPr>
+            <w:r>
+              <w:rPr>
+                <w:rFonts w:ascii="Calibri" w:cs="Calibri" w:eastAsia="Calibri" w:hAnsi="Calibri"/>
+                <w:b w:val="false"/>
+                <w:bCs w:val="false"/>
+                <w:color w:val="1F2937"/>
+                <w:sz w:val="18"/>
+                <w:szCs w:val="18"/>
+              </w:rPr>
+              <w:t xml:space="preserve">25</w:t>
+            </w:r>
+          </w:p>
+        </w:tc>
+        <w:tc>
+          <w:tcPr>
+            <w:tcW w:type="pct" w:w="7%"/>
+            <w:shd w:fill="F3F4F6" w:color="F3F4F6" w:val="solid"/>
+            <w:tcMar>
+              <w:top w:type="dxa" w:w="40"/>
+              <w:left w:type="dxa" w:w="80"/>
+              <w:bottom w:type="dxa" w:w="40"/>
+              <w:right w:type="dxa" w:w="80"/>
+            </w:tcMar>
+          </w:tcPr>
+          <w:p>
+            <w:pPr>
+              <w:spacing w:after="0"/>
+            </w:pPr>
+            <w:r>
+              <w:rPr>
+                <w:rFonts w:ascii="Calibri" w:cs="Calibri" w:eastAsia="Calibri" w:hAnsi="Calibri"/>
+                <w:b w:val="false"/>
+                <w:bCs w:val="false"/>
+                <w:color w:val="1F2937"/>
+                <w:sz w:val="18"/>
+                <w:szCs w:val="18"/>
+              </w:rPr>
+              <w:t xml:space="preserve">6%</w:t>
+            </w:r>
+          </w:p>
+        </w:tc>
+      </w:tr>
+    </w:tbl>
+    <w:p>
+      <w:pPr>
+        <w:spacing w:after="80"/>
+        <w:jc w:val="left"/>
+      </w:pPr>
+      <w:r>
+        <w:rPr>
+          <w:rFonts w:ascii="Calibri" w:cs="Calibri" w:eastAsia="Calibri" w:hAnsi="Calibri"/>
+          <w:b w:val="false"/>
+          <w:bCs w:val="false"/>
+          <w:i w:val="false"/>
+          <w:iCs w:val="false"/>
+          <w:color w:val="1F2937"/>
+          <w:sz w:val="20"/>
+          <w:szCs w:val="20"/>
+        </w:rPr>
+        <w:t xml:space="preserve">Each template also includes a sector-specific asset-class mix (buildings/machinery/vehicles/computers/furniture) for Egyptian depreciation calculations. Use getTemplate(id) to retrieve.</w:t>
       </w:r>
     </w:p>
     <w:p>

</xml_diff>

<commit_message>
fix: ROIC IC denominator (no cash netting), FCFF NWC expansion, period labels, APIC check rename
</commit_message>
<xml_diff>
--- a/Engine_Overview.docx
+++ b/Engine_Overview.docx
@@ -313,7 +313,7 @@
           <w:sz w:val="18"/>
           <w:szCs w:val="18"/>
         </w:rPr>
-        <w:t xml:space="preserve">Generated: March 7, 2026</w:t>
+        <w:t xml:space="preserve">Generated: March 9, 2026</w:t>
       </w:r>
     </w:p>
     <w:p>
@@ -9514,7 +9514,7 @@
           <w:sz w:val="18"/>
           <w:szCs w:val="18"/>
         </w:rPr>
-        <w:t xml:space="preserve">1. Extract projected FCFs from cash flow statements</w:t>
+        <w:t xml:space="preserve">1. Extract projected FCFF from Income Statement memo field (is.fcff)</w:t>
       </w:r>
     </w:p>
     <w:p>
@@ -11507,7 +11507,7 @@
           <w:sz w:val="20"/>
           <w:szCs w:val="20"/>
         </w:rPr>
-        <w:t xml:space="preserve">calculateFinancialRatios(is, bs, prevBS) computes 23 ratios using current-period IS and BS data with average balances where appropriate:</w:t>
+        <w:t xml:space="preserve">calculateFinancialRatios(is, bs, prevBS) and enrichRatios() compute 35+ ratios:</w:t>
       </w:r>
     </w:p>
     <w:tbl>
@@ -11956,6 +11956,436 @@
                 <w:szCs w:val="18"/>
               </w:rPr>
               <w:t xml:space="preserve">CCC = DSO + DIO − DPO</w:t>
+            </w:r>
+          </w:p>
+        </w:tc>
+      </w:tr>
+      <w:tr>
+        <w:tc>
+          <w:tcPr>
+            <w:tcW w:type="pct" w:w="20%"/>
+            <w:shd w:fill="F3F4F6" w:color="F3F4F6" w:val="solid"/>
+            <w:tcMar>
+              <w:top w:type="dxa" w:w="40"/>
+              <w:left w:type="dxa" w:w="80"/>
+              <w:bottom w:type="dxa" w:w="40"/>
+              <w:right w:type="dxa" w:w="80"/>
+            </w:tcMar>
+          </w:tcPr>
+          <w:p>
+            <w:pPr>
+              <w:spacing w:after="0"/>
+            </w:pPr>
+            <w:r>
+              <w:rPr>
+                <w:rFonts w:ascii="Calibri" w:cs="Calibri" w:eastAsia="Calibri" w:hAnsi="Calibri"/>
+                <w:b w:val="false"/>
+                <w:bCs w:val="false"/>
+                <w:color w:val="1F2937"/>
+                <w:sz w:val="18"/>
+                <w:szCs w:val="18"/>
+              </w:rPr>
+              <w:t xml:space="preserve">DuPont (3-Factor)</w:t>
+            </w:r>
+          </w:p>
+        </w:tc>
+        <w:tc>
+          <w:tcPr>
+            <w:tcW w:type="pct" w:w="45%"/>
+            <w:shd w:fill="F3F4F6" w:color="F3F4F6" w:val="solid"/>
+            <w:tcMar>
+              <w:top w:type="dxa" w:w="40"/>
+              <w:left w:type="dxa" w:w="80"/>
+              <w:bottom w:type="dxa" w:w="40"/>
+              <w:right w:type="dxa" w:w="80"/>
+            </w:tcMar>
+          </w:tcPr>
+          <w:p>
+            <w:pPr>
+              <w:spacing w:after="0"/>
+            </w:pPr>
+            <w:r>
+              <w:rPr>
+                <w:rFonts w:ascii="Calibri" w:cs="Calibri" w:eastAsia="Calibri" w:hAnsi="Calibri"/>
+                <w:b w:val="false"/>
+                <w:bCs w:val="false"/>
+                <w:color w:val="1F2937"/>
+                <w:sz w:val="18"/>
+                <w:szCs w:val="18"/>
+              </w:rPr>
+              <w:t xml:space="preserve">Net Margin × Asset Turnover × Equity Multiplier = ROE</w:t>
+            </w:r>
+          </w:p>
+        </w:tc>
+        <w:tc>
+          <w:tcPr>
+            <w:tcW w:type="pct" w:w="35%"/>
+            <w:shd w:fill="F3F4F6" w:color="F3F4F6" w:val="solid"/>
+            <w:tcMar>
+              <w:top w:type="dxa" w:w="40"/>
+              <w:left w:type="dxa" w:w="80"/>
+              <w:bottom w:type="dxa" w:w="40"/>
+              <w:right w:type="dxa" w:w="80"/>
+            </w:tcMar>
+          </w:tcPr>
+          <w:p>
+            <w:pPr>
+              <w:spacing w:after="0"/>
+            </w:pPr>
+            <w:r>
+              <w:rPr>
+                <w:rFonts w:ascii="Calibri" w:cs="Calibri" w:eastAsia="Calibri" w:hAnsi="Calibri"/>
+                <w:b w:val="false"/>
+                <w:bCs w:val="false"/>
+                <w:color w:val="1F2937"/>
+                <w:sz w:val="18"/>
+                <w:szCs w:val="18"/>
+              </w:rPr>
+              <w:t xml:space="preserve">Classic DuPont decomposition</w:t>
+            </w:r>
+          </w:p>
+        </w:tc>
+      </w:tr>
+      <w:tr>
+        <w:tc>
+          <w:tcPr>
+            <w:tcW w:type="pct" w:w="20%"/>
+            <w:shd w:fill="FFFFFF" w:color="FFFFFF" w:val="solid"/>
+            <w:tcMar>
+              <w:top w:type="dxa" w:w="40"/>
+              <w:left w:type="dxa" w:w="80"/>
+              <w:bottom w:type="dxa" w:w="40"/>
+              <w:right w:type="dxa" w:w="80"/>
+            </w:tcMar>
+          </w:tcPr>
+          <w:p>
+            <w:pPr>
+              <w:spacing w:after="0"/>
+            </w:pPr>
+            <w:r>
+              <w:rPr>
+                <w:rFonts w:ascii="Calibri" w:cs="Calibri" w:eastAsia="Calibri" w:hAnsi="Calibri"/>
+                <w:b w:val="false"/>
+                <w:bCs w:val="false"/>
+                <w:color w:val="1F2937"/>
+                <w:sz w:val="18"/>
+                <w:szCs w:val="18"/>
+              </w:rPr>
+              <w:t xml:space="preserve">DuPont (5-Factor)</w:t>
+            </w:r>
+          </w:p>
+        </w:tc>
+        <w:tc>
+          <w:tcPr>
+            <w:tcW w:type="pct" w:w="45%"/>
+            <w:shd w:fill="FFFFFF" w:color="FFFFFF" w:val="solid"/>
+            <w:tcMar>
+              <w:top w:type="dxa" w:w="40"/>
+              <w:left w:type="dxa" w:w="80"/>
+              <w:bottom w:type="dxa" w:w="40"/>
+              <w:right w:type="dxa" w:w="80"/>
+            </w:tcMar>
+          </w:tcPr>
+          <w:p>
+            <w:pPr>
+              <w:spacing w:after="0"/>
+            </w:pPr>
+            <w:r>
+              <w:rPr>
+                <w:rFonts w:ascii="Calibri" w:cs="Calibri" w:eastAsia="Calibri" w:hAnsi="Calibri"/>
+                <w:b w:val="false"/>
+                <w:bCs w:val="false"/>
+                <w:color w:val="1F2937"/>
+                <w:sz w:val="18"/>
+                <w:szCs w:val="18"/>
+              </w:rPr>
+              <w:t xml:space="preserve">Tax Burden × Interest Burden × Operating Margin × Asset Turnover × Equity Multiplier</w:t>
+            </w:r>
+          </w:p>
+        </w:tc>
+        <w:tc>
+          <w:tcPr>
+            <w:tcW w:type="pct" w:w="35%"/>
+            <w:shd w:fill="FFFFFF" w:color="FFFFFF" w:val="solid"/>
+            <w:tcMar>
+              <w:top w:type="dxa" w:w="40"/>
+              <w:left w:type="dxa" w:w="80"/>
+              <w:bottom w:type="dxa" w:w="40"/>
+              <w:right w:type="dxa" w:w="80"/>
+            </w:tcMar>
+          </w:tcPr>
+          <w:p>
+            <w:pPr>
+              <w:spacing w:after="0"/>
+            </w:pPr>
+            <w:r>
+              <w:rPr>
+                <w:rFonts w:ascii="Calibri" w:cs="Calibri" w:eastAsia="Calibri" w:hAnsi="Calibri"/>
+                <w:b w:val="false"/>
+                <w:bCs w:val="false"/>
+                <w:color w:val="1F2937"/>
+                <w:sz w:val="18"/>
+                <w:szCs w:val="18"/>
+              </w:rPr>
+              <w:t xml:space="preserve">Extended DuPont with tax/interest isolation</w:t>
+            </w:r>
+          </w:p>
+        </w:tc>
+      </w:tr>
+      <w:tr>
+        <w:tc>
+          <w:tcPr>
+            <w:tcW w:type="pct" w:w="20%"/>
+            <w:shd w:fill="F3F4F6" w:color="F3F4F6" w:val="solid"/>
+            <w:tcMar>
+              <w:top w:type="dxa" w:w="40"/>
+              <w:left w:type="dxa" w:w="80"/>
+              <w:bottom w:type="dxa" w:w="40"/>
+              <w:right w:type="dxa" w:w="80"/>
+            </w:tcMar>
+          </w:tcPr>
+          <w:p>
+            <w:pPr>
+              <w:spacing w:after="0"/>
+            </w:pPr>
+            <w:r>
+              <w:rPr>
+                <w:rFonts w:ascii="Calibri" w:cs="Calibri" w:eastAsia="Calibri" w:hAnsi="Calibri"/>
+                <w:b w:val="false"/>
+                <w:bCs w:val="false"/>
+                <w:color w:val="1F2937"/>
+                <w:sz w:val="18"/>
+                <w:szCs w:val="18"/>
+              </w:rPr>
+              <w:t xml:space="preserve">Altman Z-Score</w:t>
+            </w:r>
+          </w:p>
+        </w:tc>
+        <w:tc>
+          <w:tcPr>
+            <w:tcW w:type="pct" w:w="45%"/>
+            <w:shd w:fill="F3F4F6" w:color="F3F4F6" w:val="solid"/>
+            <w:tcMar>
+              <w:top w:type="dxa" w:w="40"/>
+              <w:left w:type="dxa" w:w="80"/>
+              <w:bottom w:type="dxa" w:w="40"/>
+              <w:right w:type="dxa" w:w="80"/>
+            </w:tcMar>
+          </w:tcPr>
+          <w:p>
+            <w:pPr>
+              <w:spacing w:after="0"/>
+            </w:pPr>
+            <w:r>
+              <w:rPr>
+                <w:rFonts w:ascii="Calibri" w:cs="Calibri" w:eastAsia="Calibri" w:hAnsi="Calibri"/>
+                <w:b w:val="false"/>
+                <w:bCs w:val="false"/>
+                <w:color w:val="1F2937"/>
+                <w:sz w:val="18"/>
+                <w:szCs w:val="18"/>
+              </w:rPr>
+              <w:t xml:space="preserve">Z-prime model (private companies)</w:t>
+            </w:r>
+          </w:p>
+        </w:tc>
+        <w:tc>
+          <w:tcPr>
+            <w:tcW w:type="pct" w:w="35%"/>
+            <w:shd w:fill="F3F4F6" w:color="F3F4F6" w:val="solid"/>
+            <w:tcMar>
+              <w:top w:type="dxa" w:w="40"/>
+              <w:left w:type="dxa" w:w="80"/>
+              <w:bottom w:type="dxa" w:w="40"/>
+              <w:right w:type="dxa" w:w="80"/>
+            </w:tcMar>
+          </w:tcPr>
+          <w:p>
+            <w:pPr>
+              <w:spacing w:after="0"/>
+            </w:pPr>
+            <w:r>
+              <w:rPr>
+                <w:rFonts w:ascii="Calibri" w:cs="Calibri" w:eastAsia="Calibri" w:hAnsi="Calibri"/>
+                <w:b w:val="false"/>
+                <w:bCs w:val="false"/>
+                <w:color w:val="1F2937"/>
+                <w:sz w:val="18"/>
+                <w:szCs w:val="18"/>
+              </w:rPr>
+              <w:t xml:space="preserve">safe &gt; 2.9, grey 1.23–2.9, distress &lt; 1.23</w:t>
+            </w:r>
+          </w:p>
+        </w:tc>
+      </w:tr>
+      <w:tr>
+        <w:tc>
+          <w:tcPr>
+            <w:tcW w:type="pct" w:w="20%"/>
+            <w:shd w:fill="FFFFFF" w:color="FFFFFF" w:val="solid"/>
+            <w:tcMar>
+              <w:top w:type="dxa" w:w="40"/>
+              <w:left w:type="dxa" w:w="80"/>
+              <w:bottom w:type="dxa" w:w="40"/>
+              <w:right w:type="dxa" w:w="80"/>
+            </w:tcMar>
+          </w:tcPr>
+          <w:p>
+            <w:pPr>
+              <w:spacing w:after="0"/>
+            </w:pPr>
+            <w:r>
+              <w:rPr>
+                <w:rFonts w:ascii="Calibri" w:cs="Calibri" w:eastAsia="Calibri" w:hAnsi="Calibri"/>
+                <w:b w:val="false"/>
+                <w:bCs w:val="false"/>
+                <w:color w:val="1F2937"/>
+                <w:sz w:val="18"/>
+                <w:szCs w:val="18"/>
+              </w:rPr>
+              <w:t xml:space="preserve">Altman Z-Score EM</w:t>
+            </w:r>
+          </w:p>
+        </w:tc>
+        <w:tc>
+          <w:tcPr>
+            <w:tcW w:type="pct" w:w="45%"/>
+            <w:shd w:fill="FFFFFF" w:color="FFFFFF" w:val="solid"/>
+            <w:tcMar>
+              <w:top w:type="dxa" w:w="40"/>
+              <w:left w:type="dxa" w:w="80"/>
+              <w:bottom w:type="dxa" w:w="40"/>
+              <w:right w:type="dxa" w:w="80"/>
+            </w:tcMar>
+          </w:tcPr>
+          <w:p>
+            <w:pPr>
+              <w:spacing w:after="0"/>
+            </w:pPr>
+            <w:r>
+              <w:rPr>
+                <w:rFonts w:ascii="Calibri" w:cs="Calibri" w:eastAsia="Calibri" w:hAnsi="Calibri"/>
+                <w:b w:val="false"/>
+                <w:bCs w:val="false"/>
+                <w:color w:val="1F2937"/>
+                <w:sz w:val="18"/>
+                <w:szCs w:val="18"/>
+              </w:rPr>
+              <w:t xml:space="preserve">6.56×X1 + 3.26×X2 + 6.72×X3 + 1.05×X4</w:t>
+            </w:r>
+          </w:p>
+        </w:tc>
+        <w:tc>
+          <w:tcPr>
+            <w:tcW w:type="pct" w:w="35%"/>
+            <w:shd w:fill="FFFFFF" w:color="FFFFFF" w:val="solid"/>
+            <w:tcMar>
+              <w:top w:type="dxa" w:w="40"/>
+              <w:left w:type="dxa" w:w="80"/>
+              <w:bottom w:type="dxa" w:w="40"/>
+              <w:right w:type="dxa" w:w="80"/>
+            </w:tcMar>
+          </w:tcPr>
+          <w:p>
+            <w:pPr>
+              <w:spacing w:after="0"/>
+            </w:pPr>
+            <w:r>
+              <w:rPr>
+                <w:rFonts w:ascii="Calibri" w:cs="Calibri" w:eastAsia="Calibri" w:hAnsi="Calibri"/>
+                <w:b w:val="false"/>
+                <w:bCs w:val="false"/>
+                <w:color w:val="1F2937"/>
+                <w:sz w:val="18"/>
+                <w:szCs w:val="18"/>
+              </w:rPr>
+              <w:t xml:space="preserve">Emerging Markets model (Altman 2005): safe &gt; 2.60, grey 1.10–2.60, distress &lt; 1.10</w:t>
+            </w:r>
+          </w:p>
+        </w:tc>
+      </w:tr>
+      <w:tr>
+        <w:tc>
+          <w:tcPr>
+            <w:tcW w:type="pct" w:w="20%"/>
+            <w:shd w:fill="F3F4F6" w:color="F3F4F6" w:val="solid"/>
+            <w:tcMar>
+              <w:top w:type="dxa" w:w="40"/>
+              <w:left w:type="dxa" w:w="80"/>
+              <w:bottom w:type="dxa" w:w="40"/>
+              <w:right w:type="dxa" w:w="80"/>
+            </w:tcMar>
+          </w:tcPr>
+          <w:p>
+            <w:pPr>
+              <w:spacing w:after="0"/>
+            </w:pPr>
+            <w:r>
+              <w:rPr>
+                <w:rFonts w:ascii="Calibri" w:cs="Calibri" w:eastAsia="Calibri" w:hAnsi="Calibri"/>
+                <w:b w:val="false"/>
+                <w:bCs w:val="false"/>
+                <w:color w:val="1F2937"/>
+                <w:sz w:val="18"/>
+                <w:szCs w:val="18"/>
+              </w:rPr>
+              <w:t xml:space="preserve">Break-Even</w:t>
+            </w:r>
+          </w:p>
+        </w:tc>
+        <w:tc>
+          <w:tcPr>
+            <w:tcW w:type="pct" w:w="45%"/>
+            <w:shd w:fill="F3F4F6" w:color="F3F4F6" w:val="solid"/>
+            <w:tcMar>
+              <w:top w:type="dxa" w:w="40"/>
+              <w:left w:type="dxa" w:w="80"/>
+              <w:bottom w:type="dxa" w:w="40"/>
+              <w:right w:type="dxa" w:w="80"/>
+            </w:tcMar>
+          </w:tcPr>
+          <w:p>
+            <w:pPr>
+              <w:spacing w:after="0"/>
+            </w:pPr>
+            <w:r>
+              <w:rPr>
+                <w:rFonts w:ascii="Calibri" w:cs="Calibri" w:eastAsia="Calibri" w:hAnsi="Calibri"/>
+                <w:b w:val="false"/>
+                <w:bCs w:val="false"/>
+                <w:color w:val="1F2937"/>
+                <w:sz w:val="18"/>
+                <w:szCs w:val="18"/>
+              </w:rPr>
+              <w:t xml:space="preserve">Break-Even Revenue = Fixed Costs / Contribution Margin Ratio</w:t>
+            </w:r>
+          </w:p>
+        </w:tc>
+        <w:tc>
+          <w:tcPr>
+            <w:tcW w:type="pct" w:w="35%"/>
+            <w:shd w:fill="F3F4F6" w:color="F3F4F6" w:val="solid"/>
+            <w:tcMar>
+              <w:top w:type="dxa" w:w="40"/>
+              <w:left w:type="dxa" w:w="80"/>
+              <w:bottom w:type="dxa" w:w="40"/>
+              <w:right w:type="dxa" w:w="80"/>
+            </w:tcMar>
+          </w:tcPr>
+          <w:p>
+            <w:pPr>
+              <w:spacing w:after="0"/>
+            </w:pPr>
+            <w:r>
+              <w:rPr>
+                <w:rFonts w:ascii="Calibri" w:cs="Calibri" w:eastAsia="Calibri" w:hAnsi="Calibri"/>
+                <w:b w:val="false"/>
+                <w:bCs w:val="false"/>
+                <w:color w:val="1F2937"/>
+                <w:sz w:val="18"/>
+                <w:szCs w:val="18"/>
+              </w:rPr>
+              <w:t xml:space="preserve">Margin of Safety = (Revenue − BER) / Revenue</w:t>
             </w:r>
           </w:p>
         </w:tc>

</xml_diff>

<commit_message>
Update Engine Overview, export calc sheets and Excel fixes
</commit_message>
<xml_diff>
--- a/Engine_Overview.docx
+++ b/Engine_Overview.docx
@@ -15721,7 +15721,7 @@
           <w:sz w:val="20"/>
           <w:szCs w:val="20"/>
         </w:rPr>
-        <w:t xml:space="preserve">build-scenarios.ts (445 lines) — Builds all assumption arrays per scenario; maps ROW_SPECS keys to row positions for cross-sheet references</w:t>
+        <w:t xml:space="preserve">build-scenarios.ts (471 lines) — Builds all assumption arrays per scenario; maps ROW_SPECS keys for cross-sheet references; includes ROIC, ICR, EBITDA Margin in Dashboard output metrics</w:t>
       </w:r>
     </w:p>
     <w:p>
@@ -15740,7 +15740,7 @@
           <w:sz w:val="20"/>
           <w:szCs w:val="20"/>
         </w:rPr>
-        <w:t xml:space="preserve">build-calc-sheets.ts (707 lines) — Creates hidden formula sheets (_Calc_Base, _Calc_Opt, _Calc_Con) with 90-row IS/BS/CF replicas that reference the Scenarios tab</w:t>
+        <w:t xml:space="preserve">build-calc-sheets.ts (835 lines) — Creates hidden formula sheets (_Calc_Base, _Calc_Opt, _Calc_Con) with 105-row IS/BS/CF replicas including Distributable Profit, Cumulative Legal Reserve, NOPAT, FCFF, EPD Paid rows</w:t>
       </w:r>
     </w:p>
     <w:p>
@@ -15759,7 +15759,7 @@
           <w:sz w:val="20"/>
           <w:szCs w:val="20"/>
         </w:rPr>
-        <w:t xml:space="preserve">build-dashboard.ts (397 lines) — Scenario comparison with IF() formulas switching between scenario calc sheets based on a dropdown</w:t>
+        <w:t xml:space="preserve">build-dashboard.ts (397 lines) — Scenario comparison with IF() formulas; includes Revenue, EBITDA, NI, EPS, CFO, FCF, Total Equity, ROIC, ICR, EBITDA Margin, ROE, ROA, Current Ratio, D/E</w:t>
       </w:r>
     </w:p>
     <w:p>

</xml_diff>